<commit_message>
Isso aqui não é vida não
</commit_message>
<xml_diff>
--- a/Docs/CesuChess_Casos_de_Teste.docx
+++ b/Docs/CesuChess_Casos_de_Teste.docx
@@ -49,7 +49,7 @@
           <w:color w:val="666666"/>
           <w:sz w:val="20"/>
         </w:rPr>
-        <w:t>Versão 1.0  |  Sprint 2  |  19/05/2026</w:t>
+        <w:t>Versão 2.0  |  Sprint 3  |  26/05/2026</w:t>
       </w:r>
     </w:p>
     <w:p>
@@ -6787,6 +6787,4907 @@
       <w:pPr>
         <w:spacing w:after="120"/>
       </w:pPr>
+    </w:p>
+    <w:p/>
+    <w:p>
+      <w:pPr>
+        <w:pStyle w:val="Heading2"/>
+      </w:pPr>
+      <w:r>
+        <w:t>3. Casos de Teste — Sprint 3</w:t>
+      </w:r>
+    </w:p>
+    <w:p>
+      <w:r>
+        <w:t>Esta seção complementa a documentação existente com os casos de teste introduzidos pelos novos CRUDs e pelas suítes de integração e E2E entregues no Sprint 3. Os identificadores continuam a numeração da Sprint 2, começando em CT-18.</w:t>
+      </w:r>
+    </w:p>
+    <w:p>
+      <w:r>
+        <w:rPr>
+          <w:b/>
+        </w:rPr>
+        <w:t>CT-18 — applyMove — lance legal de abertura</w:t>
+      </w:r>
+    </w:p>
+    <w:tbl>
+      <w:tblPr>
+        <w:tblStyle w:val="LightGrid-Accent1"/>
+        <w:tblW w:type="auto" w:w="0"/>
+        <w:tblLook w:firstColumn="1" w:firstRow="1" w:lastColumn="0" w:lastRow="0" w:noHBand="0" w:noVBand="1" w:val="04A0"/>
+      </w:tblPr>
+      <w:tblGrid>
+        <w:gridCol w:w="4514"/>
+        <w:gridCol w:w="4514"/>
+      </w:tblGrid>
+      <w:tr>
+        <w:tc>
+          <w:tcPr>
+            <w:tcW w:type="dxa" w:w="4514"/>
+          </w:tcPr>
+          <w:p>
+            <w:r>
+              <w:rPr>
+                <w:b/>
+              </w:rPr>
+              <w:t>ID</w:t>
+            </w:r>
+          </w:p>
+        </w:tc>
+        <w:tc>
+          <w:tcPr>
+            <w:tcW w:type="dxa" w:w="4514"/>
+          </w:tcPr>
+          <w:p>
+            <w:r>
+              <w:t>CT-18</w:t>
+            </w:r>
+          </w:p>
+        </w:tc>
+      </w:tr>
+      <w:tr>
+        <w:tc>
+          <w:tcPr>
+            <w:tcW w:type="dxa" w:w="4514"/>
+          </w:tcPr>
+          <w:p>
+            <w:r>
+              <w:rPr>
+                <w:b/>
+              </w:rPr>
+              <w:t>Nome</w:t>
+            </w:r>
+          </w:p>
+        </w:tc>
+        <w:tc>
+          <w:tcPr>
+            <w:tcW w:type="dxa" w:w="4514"/>
+          </w:tcPr>
+          <w:p>
+            <w:r>
+              <w:t>applyMove — lance legal de abertura</w:t>
+            </w:r>
+          </w:p>
+        </w:tc>
+      </w:tr>
+      <w:tr>
+        <w:tc>
+          <w:tcPr>
+            <w:tcW w:type="dxa" w:w="4514"/>
+          </w:tcPr>
+          <w:p>
+            <w:r>
+              <w:rPr>
+                <w:b/>
+              </w:rPr>
+              <w:t>Objetivo</w:t>
+            </w:r>
+          </w:p>
+        </w:tc>
+        <w:tc>
+          <w:tcPr>
+            <w:tcW w:type="dxa" w:w="4514"/>
+          </w:tcPr>
+          <w:p>
+            <w:r>
+              <w:t>Verificar que o engine aceita o lance e2→e4 nas brancas a partir da posição inicial.</w:t>
+            </w:r>
+          </w:p>
+        </w:tc>
+      </w:tr>
+      <w:tr>
+        <w:tc>
+          <w:tcPr>
+            <w:tcW w:type="dxa" w:w="4514"/>
+          </w:tcPr>
+          <w:p>
+            <w:r>
+              <w:rPr>
+                <w:b/>
+              </w:rPr>
+              <w:t>Pré-condições</w:t>
+            </w:r>
+          </w:p>
+        </w:tc>
+        <w:tc>
+          <w:tcPr>
+            <w:tcW w:type="dxa" w:w="4514"/>
+          </w:tcPr>
+          <w:p>
+            <w:r>
+              <w:t>chessEngine.applyMove disponível; chess.js instalado.</w:t>
+            </w:r>
+          </w:p>
+        </w:tc>
+      </w:tr>
+      <w:tr>
+        <w:tc>
+          <w:tcPr>
+            <w:tcW w:type="dxa" w:w="4514"/>
+          </w:tcPr>
+          <w:p>
+            <w:r>
+              <w:rPr>
+                <w:b/>
+              </w:rPr>
+              <w:t>Fluxo / Passos</w:t>
+            </w:r>
+          </w:p>
+        </w:tc>
+        <w:tc>
+          <w:tcPr>
+            <w:tcW w:type="dxa" w:w="4514"/>
+          </w:tcPr>
+          <w:p>
+            <w:r>
+              <w:t>Dados de entrada: nova instância Chess(), origem "e2", destino "e4".</w:t>
+              <w:br/>
+              <w:t>Passos: chamar applyMove(game, "e2", "e4").</w:t>
+            </w:r>
+          </w:p>
+        </w:tc>
+      </w:tr>
+      <w:tr>
+        <w:tc>
+          <w:tcPr>
+            <w:tcW w:type="dxa" w:w="4514"/>
+          </w:tcPr>
+          <w:p>
+            <w:r>
+              <w:rPr>
+                <w:b/>
+              </w:rPr>
+              <w:t>Resultado Esperado</w:t>
+            </w:r>
+          </w:p>
+        </w:tc>
+        <w:tc>
+          <w:tcPr>
+            <w:tcW w:type="dxa" w:w="4514"/>
+          </w:tcPr>
+          <w:p>
+            <w:r>
+              <w:t>A função deve retornar uma NOVA instância Chess (imutabilidade preservada), com history() contendo "e4" e turn() = "b".</w:t>
+            </w:r>
+          </w:p>
+        </w:tc>
+      </w:tr>
+      <w:tr>
+        <w:tc>
+          <w:tcPr>
+            <w:tcW w:type="dxa" w:w="4514"/>
+          </w:tcPr>
+          <w:p>
+            <w:r>
+              <w:rPr>
+                <w:b/>
+              </w:rPr>
+              <w:t>Status</w:t>
+            </w:r>
+          </w:p>
+        </w:tc>
+        <w:tc>
+          <w:tcPr>
+            <w:tcW w:type="dxa" w:w="4514"/>
+          </w:tcPr>
+          <w:p>
+            <w:r>
+              <w:t>🟢 Aprovado</w:t>
+            </w:r>
+          </w:p>
+        </w:tc>
+      </w:tr>
+    </w:tbl>
+    <w:p/>
+    <w:p>
+      <w:r>
+        <w:rPr>
+          <w:b/>
+        </w:rPr>
+        <w:t>CT-19 — applyMove — lance ilegal rejeitado</w:t>
+      </w:r>
+    </w:p>
+    <w:tbl>
+      <w:tblPr>
+        <w:tblStyle w:val="LightGrid-Accent1"/>
+        <w:tblW w:type="auto" w:w="0"/>
+        <w:tblLook w:firstColumn="1" w:firstRow="1" w:lastColumn="0" w:lastRow="0" w:noHBand="0" w:noVBand="1" w:val="04A0"/>
+      </w:tblPr>
+      <w:tblGrid>
+        <w:gridCol w:w="4514"/>
+        <w:gridCol w:w="4514"/>
+      </w:tblGrid>
+      <w:tr>
+        <w:tc>
+          <w:tcPr>
+            <w:tcW w:type="dxa" w:w="4514"/>
+          </w:tcPr>
+          <w:p>
+            <w:r>
+              <w:rPr>
+                <w:b/>
+              </w:rPr>
+              <w:t>ID</w:t>
+            </w:r>
+          </w:p>
+        </w:tc>
+        <w:tc>
+          <w:tcPr>
+            <w:tcW w:type="dxa" w:w="4514"/>
+          </w:tcPr>
+          <w:p>
+            <w:r>
+              <w:t>CT-19</w:t>
+            </w:r>
+          </w:p>
+        </w:tc>
+      </w:tr>
+      <w:tr>
+        <w:tc>
+          <w:tcPr>
+            <w:tcW w:type="dxa" w:w="4514"/>
+          </w:tcPr>
+          <w:p>
+            <w:r>
+              <w:rPr>
+                <w:b/>
+              </w:rPr>
+              <w:t>Nome</w:t>
+            </w:r>
+          </w:p>
+        </w:tc>
+        <w:tc>
+          <w:tcPr>
+            <w:tcW w:type="dxa" w:w="4514"/>
+          </w:tcPr>
+          <w:p>
+            <w:r>
+              <w:t>applyMove — lance ilegal rejeitado</w:t>
+            </w:r>
+          </w:p>
+        </w:tc>
+      </w:tr>
+      <w:tr>
+        <w:tc>
+          <w:tcPr>
+            <w:tcW w:type="dxa" w:w="4514"/>
+          </w:tcPr>
+          <w:p>
+            <w:r>
+              <w:rPr>
+                <w:b/>
+              </w:rPr>
+              <w:t>Objetivo</w:t>
+            </w:r>
+          </w:p>
+        </w:tc>
+        <w:tc>
+          <w:tcPr>
+            <w:tcW w:type="dxa" w:w="4514"/>
+          </w:tcPr>
+          <w:p>
+            <w:r>
+              <w:t>Verificar que tentar avançar peão de e2 para e5 retorna null sem modificar o estado original (RN-090 cláusula 2).</w:t>
+            </w:r>
+          </w:p>
+        </w:tc>
+      </w:tr>
+      <w:tr>
+        <w:tc>
+          <w:tcPr>
+            <w:tcW w:type="dxa" w:w="4514"/>
+          </w:tcPr>
+          <w:p>
+            <w:r>
+              <w:rPr>
+                <w:b/>
+              </w:rPr>
+              <w:t>Pré-condições</w:t>
+            </w:r>
+          </w:p>
+        </w:tc>
+        <w:tc>
+          <w:tcPr>
+            <w:tcW w:type="dxa" w:w="4514"/>
+          </w:tcPr>
+          <w:p>
+            <w:r>
+              <w:t>Engine disponível.</w:t>
+            </w:r>
+          </w:p>
+        </w:tc>
+      </w:tr>
+      <w:tr>
+        <w:tc>
+          <w:tcPr>
+            <w:tcW w:type="dxa" w:w="4514"/>
+          </w:tcPr>
+          <w:p>
+            <w:r>
+              <w:rPr>
+                <w:b/>
+              </w:rPr>
+              <w:t>Fluxo / Passos</w:t>
+            </w:r>
+          </w:p>
+        </w:tc>
+        <w:tc>
+          <w:tcPr>
+            <w:tcW w:type="dxa" w:w="4514"/>
+          </w:tcPr>
+          <w:p>
+            <w:r>
+              <w:t>Dados de entrada: Chess(), origem "e2", destino "e5".</w:t>
+              <w:br/>
+              <w:t>Passos: chamar applyMove(game, "e2", "e5").</w:t>
+            </w:r>
+          </w:p>
+        </w:tc>
+      </w:tr>
+      <w:tr>
+        <w:tc>
+          <w:tcPr>
+            <w:tcW w:type="dxa" w:w="4514"/>
+          </w:tcPr>
+          <w:p>
+            <w:r>
+              <w:rPr>
+                <w:b/>
+              </w:rPr>
+              <w:t>Resultado Esperado</w:t>
+            </w:r>
+          </w:p>
+        </w:tc>
+        <w:tc>
+          <w:tcPr>
+            <w:tcW w:type="dxa" w:w="4514"/>
+          </w:tcPr>
+          <w:p>
+            <w:r>
+              <w:t>A função deve retornar null. O game original deve permanecer com history() vazio.</w:t>
+            </w:r>
+          </w:p>
+        </w:tc>
+      </w:tr>
+      <w:tr>
+        <w:tc>
+          <w:tcPr>
+            <w:tcW w:type="dxa" w:w="4514"/>
+          </w:tcPr>
+          <w:p>
+            <w:r>
+              <w:rPr>
+                <w:b/>
+              </w:rPr>
+              <w:t>Status</w:t>
+            </w:r>
+          </w:p>
+        </w:tc>
+        <w:tc>
+          <w:tcPr>
+            <w:tcW w:type="dxa" w:w="4514"/>
+          </w:tcPr>
+          <w:p>
+            <w:r>
+              <w:t>🟢 Aprovado</w:t>
+            </w:r>
+          </w:p>
+        </w:tc>
+      </w:tr>
+    </w:tbl>
+    <w:p/>
+    <w:p>
+      <w:r>
+        <w:rPr>
+          <w:b/>
+        </w:rPr>
+        <w:t>CT-20 — applyMove — promoção automática a Dama</w:t>
+      </w:r>
+    </w:p>
+    <w:tbl>
+      <w:tblPr>
+        <w:tblStyle w:val="LightGrid-Accent1"/>
+        <w:tblW w:type="auto" w:w="0"/>
+        <w:tblLook w:firstColumn="1" w:firstRow="1" w:lastColumn="0" w:lastRow="0" w:noHBand="0" w:noVBand="1" w:val="04A0"/>
+      </w:tblPr>
+      <w:tblGrid>
+        <w:gridCol w:w="4514"/>
+        <w:gridCol w:w="4514"/>
+      </w:tblGrid>
+      <w:tr>
+        <w:tc>
+          <w:tcPr>
+            <w:tcW w:type="dxa" w:w="4514"/>
+          </w:tcPr>
+          <w:p>
+            <w:r>
+              <w:rPr>
+                <w:b/>
+              </w:rPr>
+              <w:t>ID</w:t>
+            </w:r>
+          </w:p>
+        </w:tc>
+        <w:tc>
+          <w:tcPr>
+            <w:tcW w:type="dxa" w:w="4514"/>
+          </w:tcPr>
+          <w:p>
+            <w:r>
+              <w:t>CT-20</w:t>
+            </w:r>
+          </w:p>
+        </w:tc>
+      </w:tr>
+      <w:tr>
+        <w:tc>
+          <w:tcPr>
+            <w:tcW w:type="dxa" w:w="4514"/>
+          </w:tcPr>
+          <w:p>
+            <w:r>
+              <w:rPr>
+                <w:b/>
+              </w:rPr>
+              <w:t>Nome</w:t>
+            </w:r>
+          </w:p>
+        </w:tc>
+        <w:tc>
+          <w:tcPr>
+            <w:tcW w:type="dxa" w:w="4514"/>
+          </w:tcPr>
+          <w:p>
+            <w:r>
+              <w:t>applyMove — promoção automática a Dama</w:t>
+            </w:r>
+          </w:p>
+        </w:tc>
+      </w:tr>
+      <w:tr>
+        <w:tc>
+          <w:tcPr>
+            <w:tcW w:type="dxa" w:w="4514"/>
+          </w:tcPr>
+          <w:p>
+            <w:r>
+              <w:rPr>
+                <w:b/>
+              </w:rPr>
+              <w:t>Objetivo</w:t>
+            </w:r>
+          </w:p>
+        </w:tc>
+        <w:tc>
+          <w:tcPr>
+            <w:tcW w:type="dxa" w:w="4514"/>
+          </w:tcPr>
+          <w:p>
+            <w:r>
+              <w:t>Verificar que quando um peão branco em a7 é movido para a8, ele é promovido a Dama (RN-042).</w:t>
+            </w:r>
+          </w:p>
+        </w:tc>
+      </w:tr>
+      <w:tr>
+        <w:tc>
+          <w:tcPr>
+            <w:tcW w:type="dxa" w:w="4514"/>
+          </w:tcPr>
+          <w:p>
+            <w:r>
+              <w:rPr>
+                <w:b/>
+              </w:rPr>
+              <w:t>Pré-condições</w:t>
+            </w:r>
+          </w:p>
+        </w:tc>
+        <w:tc>
+          <w:tcPr>
+            <w:tcW w:type="dxa" w:w="4514"/>
+          </w:tcPr>
+          <w:p>
+            <w:r>
+              <w:t>FEN específica preparada com peão branco em a7.</w:t>
+            </w:r>
+          </w:p>
+        </w:tc>
+      </w:tr>
+      <w:tr>
+        <w:tc>
+          <w:tcPr>
+            <w:tcW w:type="dxa" w:w="4514"/>
+          </w:tcPr>
+          <w:p>
+            <w:r>
+              <w:rPr>
+                <w:b/>
+              </w:rPr>
+              <w:t>Fluxo / Passos</w:t>
+            </w:r>
+          </w:p>
+        </w:tc>
+        <w:tc>
+          <w:tcPr>
+            <w:tcW w:type="dxa" w:w="4514"/>
+          </w:tcPr>
+          <w:p>
+            <w:r>
+              <w:t>Dados de entrada: Chess("8/P7/8/8/8/8/8/4K2k w - - 0 1"), origem "a7", destino "a8".</w:t>
+              <w:br/>
+              <w:t>Passos: chamar applyMove e inspecionar a peça em a8.</w:t>
+            </w:r>
+          </w:p>
+        </w:tc>
+      </w:tr>
+      <w:tr>
+        <w:tc>
+          <w:tcPr>
+            <w:tcW w:type="dxa" w:w="4514"/>
+          </w:tcPr>
+          <w:p>
+            <w:r>
+              <w:rPr>
+                <w:b/>
+              </w:rPr>
+              <w:t>Resultado Esperado</w:t>
+            </w:r>
+          </w:p>
+        </w:tc>
+        <w:tc>
+          <w:tcPr>
+            <w:tcW w:type="dxa" w:w="4514"/>
+          </w:tcPr>
+          <w:p>
+            <w:r>
+              <w:t>A peça em a8 deve ser do tipo "q" (Dama) e cor "w" (branca).</w:t>
+            </w:r>
+          </w:p>
+        </w:tc>
+      </w:tr>
+      <w:tr>
+        <w:tc>
+          <w:tcPr>
+            <w:tcW w:type="dxa" w:w="4514"/>
+          </w:tcPr>
+          <w:p>
+            <w:r>
+              <w:rPr>
+                <w:b/>
+              </w:rPr>
+              <w:t>Status</w:t>
+            </w:r>
+          </w:p>
+        </w:tc>
+        <w:tc>
+          <w:tcPr>
+            <w:tcW w:type="dxa" w:w="4514"/>
+          </w:tcPr>
+          <w:p>
+            <w:r>
+              <w:t>🟢 Aprovado</w:t>
+            </w:r>
+          </w:p>
+        </w:tc>
+      </w:tr>
+    </w:tbl>
+    <w:p/>
+    <w:p>
+      <w:r>
+        <w:rPr>
+          <w:b/>
+        </w:rPr>
+        <w:t>CT-21 — encodeSession + decodeSession — round-trip</w:t>
+      </w:r>
+    </w:p>
+    <w:tbl>
+      <w:tblPr>
+        <w:tblStyle w:val="LightGrid-Accent1"/>
+        <w:tblW w:type="auto" w:w="0"/>
+        <w:tblLook w:firstColumn="1" w:firstRow="1" w:lastColumn="0" w:lastRow="0" w:noHBand="0" w:noVBand="1" w:val="04A0"/>
+      </w:tblPr>
+      <w:tblGrid>
+        <w:gridCol w:w="4514"/>
+        <w:gridCol w:w="4514"/>
+      </w:tblGrid>
+      <w:tr>
+        <w:tc>
+          <w:tcPr>
+            <w:tcW w:type="dxa" w:w="4514"/>
+          </w:tcPr>
+          <w:p>
+            <w:r>
+              <w:rPr>
+                <w:b/>
+              </w:rPr>
+              <w:t>ID</w:t>
+            </w:r>
+          </w:p>
+        </w:tc>
+        <w:tc>
+          <w:tcPr>
+            <w:tcW w:type="dxa" w:w="4514"/>
+          </w:tcPr>
+          <w:p>
+            <w:r>
+              <w:t>CT-21</w:t>
+            </w:r>
+          </w:p>
+        </w:tc>
+      </w:tr>
+      <w:tr>
+        <w:tc>
+          <w:tcPr>
+            <w:tcW w:type="dxa" w:w="4514"/>
+          </w:tcPr>
+          <w:p>
+            <w:r>
+              <w:rPr>
+                <w:b/>
+              </w:rPr>
+              <w:t>Nome</w:t>
+            </w:r>
+          </w:p>
+        </w:tc>
+        <w:tc>
+          <w:tcPr>
+            <w:tcW w:type="dxa" w:w="4514"/>
+          </w:tcPr>
+          <w:p>
+            <w:r>
+              <w:t>encodeSession + decodeSession — round-trip</w:t>
+            </w:r>
+          </w:p>
+        </w:tc>
+      </w:tr>
+      <w:tr>
+        <w:tc>
+          <w:tcPr>
+            <w:tcW w:type="dxa" w:w="4514"/>
+          </w:tcPr>
+          <w:p>
+            <w:r>
+              <w:rPr>
+                <w:b/>
+              </w:rPr>
+              <w:t>Objetivo</w:t>
+            </w:r>
+          </w:p>
+        </w:tc>
+        <w:tc>
+          <w:tcPr>
+            <w:tcW w:type="dxa" w:w="4514"/>
+          </w:tcPr>
+          <w:p>
+            <w:r>
+              <w:t>Garantir que o cookie de sessão codificado pode ser decodificado de volta para o mesmo usuarioId.</w:t>
+            </w:r>
+          </w:p>
+        </w:tc>
+      </w:tr>
+      <w:tr>
+        <w:tc>
+          <w:tcPr>
+            <w:tcW w:type="dxa" w:w="4514"/>
+          </w:tcPr>
+          <w:p>
+            <w:r>
+              <w:rPr>
+                <w:b/>
+              </w:rPr>
+              <w:t>Pré-condições</w:t>
+            </w:r>
+          </w:p>
+        </w:tc>
+        <w:tc>
+          <w:tcPr>
+            <w:tcW w:type="dxa" w:w="4514"/>
+          </w:tcPr>
+          <w:p>
+            <w:r>
+              <w:t>SESSION_SECRET configurado no ambiente.</w:t>
+            </w:r>
+          </w:p>
+        </w:tc>
+      </w:tr>
+      <w:tr>
+        <w:tc>
+          <w:tcPr>
+            <w:tcW w:type="dxa" w:w="4514"/>
+          </w:tcPr>
+          <w:p>
+            <w:r>
+              <w:rPr>
+                <w:b/>
+              </w:rPr>
+              <w:t>Fluxo / Passos</w:t>
+            </w:r>
+          </w:p>
+        </w:tc>
+        <w:tc>
+          <w:tcPr>
+            <w:tcW w:type="dxa" w:w="4514"/>
+          </w:tcPr>
+          <w:p>
+            <w:r>
+              <w:t>Passos: encodeSession(uuid) → cookie; decodeSession(cookie) → uuid lido.</w:t>
+            </w:r>
+          </w:p>
+        </w:tc>
+      </w:tr>
+      <w:tr>
+        <w:tc>
+          <w:tcPr>
+            <w:tcW w:type="dxa" w:w="4514"/>
+          </w:tcPr>
+          <w:p>
+            <w:r>
+              <w:rPr>
+                <w:b/>
+              </w:rPr>
+              <w:t>Resultado Esperado</w:t>
+            </w:r>
+          </w:p>
+        </w:tc>
+        <w:tc>
+          <w:tcPr>
+            <w:tcW w:type="dxa" w:w="4514"/>
+          </w:tcPr>
+          <w:p>
+            <w:r>
+              <w:t>O uuid lido deve ser idêntico ao usuarioId original.</w:t>
+            </w:r>
+          </w:p>
+        </w:tc>
+      </w:tr>
+      <w:tr>
+        <w:tc>
+          <w:tcPr>
+            <w:tcW w:type="dxa" w:w="4514"/>
+          </w:tcPr>
+          <w:p>
+            <w:r>
+              <w:rPr>
+                <w:b/>
+              </w:rPr>
+              <w:t>Status</w:t>
+            </w:r>
+          </w:p>
+        </w:tc>
+        <w:tc>
+          <w:tcPr>
+            <w:tcW w:type="dxa" w:w="4514"/>
+          </w:tcPr>
+          <w:p>
+            <w:r>
+              <w:t>🟢 Aprovado</w:t>
+            </w:r>
+          </w:p>
+        </w:tc>
+      </w:tr>
+    </w:tbl>
+    <w:p/>
+    <w:p>
+      <w:r>
+        <w:rPr>
+          <w:b/>
+        </w:rPr>
+        <w:t>CT-22 — decodeSession — rejeita cookie adulterado</w:t>
+      </w:r>
+    </w:p>
+    <w:tbl>
+      <w:tblPr>
+        <w:tblStyle w:val="LightGrid-Accent1"/>
+        <w:tblW w:type="auto" w:w="0"/>
+        <w:tblLook w:firstColumn="1" w:firstRow="1" w:lastColumn="0" w:lastRow="0" w:noHBand="0" w:noVBand="1" w:val="04A0"/>
+      </w:tblPr>
+      <w:tblGrid>
+        <w:gridCol w:w="4514"/>
+        <w:gridCol w:w="4514"/>
+      </w:tblGrid>
+      <w:tr>
+        <w:tc>
+          <w:tcPr>
+            <w:tcW w:type="dxa" w:w="4514"/>
+          </w:tcPr>
+          <w:p>
+            <w:r>
+              <w:rPr>
+                <w:b/>
+              </w:rPr>
+              <w:t>ID</w:t>
+            </w:r>
+          </w:p>
+        </w:tc>
+        <w:tc>
+          <w:tcPr>
+            <w:tcW w:type="dxa" w:w="4514"/>
+          </w:tcPr>
+          <w:p>
+            <w:r>
+              <w:t>CT-22</w:t>
+            </w:r>
+          </w:p>
+        </w:tc>
+      </w:tr>
+      <w:tr>
+        <w:tc>
+          <w:tcPr>
+            <w:tcW w:type="dxa" w:w="4514"/>
+          </w:tcPr>
+          <w:p>
+            <w:r>
+              <w:rPr>
+                <w:b/>
+              </w:rPr>
+              <w:t>Nome</w:t>
+            </w:r>
+          </w:p>
+        </w:tc>
+        <w:tc>
+          <w:tcPr>
+            <w:tcW w:type="dxa" w:w="4514"/>
+          </w:tcPr>
+          <w:p>
+            <w:r>
+              <w:t>decodeSession — rejeita cookie adulterado</w:t>
+            </w:r>
+          </w:p>
+        </w:tc>
+      </w:tr>
+      <w:tr>
+        <w:tc>
+          <w:tcPr>
+            <w:tcW w:type="dxa" w:w="4514"/>
+          </w:tcPr>
+          <w:p>
+            <w:r>
+              <w:rPr>
+                <w:b/>
+              </w:rPr>
+              <w:t>Objetivo</w:t>
+            </w:r>
+          </w:p>
+        </w:tc>
+        <w:tc>
+          <w:tcPr>
+            <w:tcW w:type="dxa" w:w="4514"/>
+          </w:tcPr>
+          <w:p>
+            <w:r>
+              <w:t>Garantir que alterar qualquer parte do cookie (payload ou assinatura) faz o decodeSession retornar null.</w:t>
+            </w:r>
+          </w:p>
+        </w:tc>
+      </w:tr>
+      <w:tr>
+        <w:tc>
+          <w:tcPr>
+            <w:tcW w:type="dxa" w:w="4514"/>
+          </w:tcPr>
+          <w:p>
+            <w:r>
+              <w:rPr>
+                <w:b/>
+              </w:rPr>
+              <w:t>Pré-condições</w:t>
+            </w:r>
+          </w:p>
+        </w:tc>
+        <w:tc>
+          <w:tcPr>
+            <w:tcW w:type="dxa" w:w="4514"/>
+          </w:tcPr>
+          <w:p>
+            <w:r>
+              <w:t>SESSION_SECRET configurado.</w:t>
+            </w:r>
+          </w:p>
+        </w:tc>
+      </w:tr>
+      <w:tr>
+        <w:tc>
+          <w:tcPr>
+            <w:tcW w:type="dxa" w:w="4514"/>
+          </w:tcPr>
+          <w:p>
+            <w:r>
+              <w:rPr>
+                <w:b/>
+              </w:rPr>
+              <w:t>Fluxo / Passos</w:t>
+            </w:r>
+          </w:p>
+        </w:tc>
+        <w:tc>
+          <w:tcPr>
+            <w:tcW w:type="dxa" w:w="4514"/>
+          </w:tcPr>
+          <w:p>
+            <w:r>
+              <w:t>Passos: gera cookie válido; substitui a assinatura por outra string; tenta decodificar.</w:t>
+            </w:r>
+          </w:p>
+        </w:tc>
+      </w:tr>
+      <w:tr>
+        <w:tc>
+          <w:tcPr>
+            <w:tcW w:type="dxa" w:w="4514"/>
+          </w:tcPr>
+          <w:p>
+            <w:r>
+              <w:rPr>
+                <w:b/>
+              </w:rPr>
+              <w:t>Resultado Esperado</w:t>
+            </w:r>
+          </w:p>
+        </w:tc>
+        <w:tc>
+          <w:tcPr>
+            <w:tcW w:type="dxa" w:w="4514"/>
+          </w:tcPr>
+          <w:p>
+            <w:r>
+              <w:t>decodeSession deve retornar null.</w:t>
+            </w:r>
+          </w:p>
+        </w:tc>
+      </w:tr>
+      <w:tr>
+        <w:tc>
+          <w:tcPr>
+            <w:tcW w:type="dxa" w:w="4514"/>
+          </w:tcPr>
+          <w:p>
+            <w:r>
+              <w:rPr>
+                <w:b/>
+              </w:rPr>
+              <w:t>Status</w:t>
+            </w:r>
+          </w:p>
+        </w:tc>
+        <w:tc>
+          <w:tcPr>
+            <w:tcW w:type="dxa" w:w="4514"/>
+          </w:tcPr>
+          <w:p>
+            <w:r>
+              <w:t>🟢 Aprovado</w:t>
+            </w:r>
+          </w:p>
+        </w:tc>
+      </w:tr>
+    </w:tbl>
+    <w:p/>
+    <w:p>
+      <w:r>
+        <w:rPr>
+          <w:b/>
+        </w:rPr>
+        <w:t>CT-23 — decodeSession — expiração de 7 dias</w:t>
+      </w:r>
+    </w:p>
+    <w:tbl>
+      <w:tblPr>
+        <w:tblStyle w:val="LightGrid-Accent1"/>
+        <w:tblW w:type="auto" w:w="0"/>
+        <w:tblLook w:firstColumn="1" w:firstRow="1" w:lastColumn="0" w:lastRow="0" w:noHBand="0" w:noVBand="1" w:val="04A0"/>
+      </w:tblPr>
+      <w:tblGrid>
+        <w:gridCol w:w="4514"/>
+        <w:gridCol w:w="4514"/>
+      </w:tblGrid>
+      <w:tr>
+        <w:tc>
+          <w:tcPr>
+            <w:tcW w:type="dxa" w:w="4514"/>
+          </w:tcPr>
+          <w:p>
+            <w:r>
+              <w:rPr>
+                <w:b/>
+              </w:rPr>
+              <w:t>ID</w:t>
+            </w:r>
+          </w:p>
+        </w:tc>
+        <w:tc>
+          <w:tcPr>
+            <w:tcW w:type="dxa" w:w="4514"/>
+          </w:tcPr>
+          <w:p>
+            <w:r>
+              <w:t>CT-23</w:t>
+            </w:r>
+          </w:p>
+        </w:tc>
+      </w:tr>
+      <w:tr>
+        <w:tc>
+          <w:tcPr>
+            <w:tcW w:type="dxa" w:w="4514"/>
+          </w:tcPr>
+          <w:p>
+            <w:r>
+              <w:rPr>
+                <w:b/>
+              </w:rPr>
+              <w:t>Nome</w:t>
+            </w:r>
+          </w:p>
+        </w:tc>
+        <w:tc>
+          <w:tcPr>
+            <w:tcW w:type="dxa" w:w="4514"/>
+          </w:tcPr>
+          <w:p>
+            <w:r>
+              <w:t>decodeSession — expiração de 7 dias</w:t>
+            </w:r>
+          </w:p>
+        </w:tc>
+      </w:tr>
+      <w:tr>
+        <w:tc>
+          <w:tcPr>
+            <w:tcW w:type="dxa" w:w="4514"/>
+          </w:tcPr>
+          <w:p>
+            <w:r>
+              <w:rPr>
+                <w:b/>
+              </w:rPr>
+              <w:t>Objetivo</w:t>
+            </w:r>
+          </w:p>
+        </w:tc>
+        <w:tc>
+          <w:tcPr>
+            <w:tcW w:type="dxa" w:w="4514"/>
+          </w:tcPr>
+          <w:p>
+            <w:r>
+              <w:t>Verificar que o timestamp gravado no cookie corresponde ao prazo de 7 dias.</w:t>
+            </w:r>
+          </w:p>
+        </w:tc>
+      </w:tr>
+      <w:tr>
+        <w:tc>
+          <w:tcPr>
+            <w:tcW w:type="dxa" w:w="4514"/>
+          </w:tcPr>
+          <w:p>
+            <w:r>
+              <w:rPr>
+                <w:b/>
+              </w:rPr>
+              <w:t>Pré-condições</w:t>
+            </w:r>
+          </w:p>
+        </w:tc>
+        <w:tc>
+          <w:tcPr>
+            <w:tcW w:type="dxa" w:w="4514"/>
+          </w:tcPr>
+          <w:p>
+            <w:r>
+              <w:t>SESSION_SECRET configurado.</w:t>
+            </w:r>
+          </w:p>
+        </w:tc>
+      </w:tr>
+      <w:tr>
+        <w:tc>
+          <w:tcPr>
+            <w:tcW w:type="dxa" w:w="4514"/>
+          </w:tcPr>
+          <w:p>
+            <w:r>
+              <w:rPr>
+                <w:b/>
+              </w:rPr>
+              <w:t>Fluxo / Passos</w:t>
+            </w:r>
+          </w:p>
+        </w:tc>
+        <w:tc>
+          <w:tcPr>
+            <w:tcW w:type="dxa" w:w="4514"/>
+          </w:tcPr>
+          <w:p>
+            <w:r>
+              <w:t>Passos: encodeSession e extrair o segundo segmento (exp).</w:t>
+            </w:r>
+          </w:p>
+        </w:tc>
+      </w:tr>
+      <w:tr>
+        <w:tc>
+          <w:tcPr>
+            <w:tcW w:type="dxa" w:w="4514"/>
+          </w:tcPr>
+          <w:p>
+            <w:r>
+              <w:rPr>
+                <w:b/>
+              </w:rPr>
+              <w:t>Resultado Esperado</w:t>
+            </w:r>
+          </w:p>
+        </w:tc>
+        <w:tc>
+          <w:tcPr>
+            <w:tcW w:type="dxa" w:w="4514"/>
+          </w:tcPr>
+          <w:p>
+            <w:r>
+              <w:t>exp - now deve estar entre 7*24*3600 - 5s e 7*24*3600 + 5s.</w:t>
+            </w:r>
+          </w:p>
+        </w:tc>
+      </w:tr>
+      <w:tr>
+        <w:tc>
+          <w:tcPr>
+            <w:tcW w:type="dxa" w:w="4514"/>
+          </w:tcPr>
+          <w:p>
+            <w:r>
+              <w:rPr>
+                <w:b/>
+              </w:rPr>
+              <w:t>Status</w:t>
+            </w:r>
+          </w:p>
+        </w:tc>
+        <w:tc>
+          <w:tcPr>
+            <w:tcW w:type="dxa" w:w="4514"/>
+          </w:tcPr>
+          <w:p>
+            <w:r>
+              <w:t>🟢 Aprovado</w:t>
+            </w:r>
+          </w:p>
+        </w:tc>
+      </w:tr>
+    </w:tbl>
+    <w:p/>
+    <w:p>
+      <w:r>
+        <w:rPr>
+          <w:b/>
+        </w:rPr>
+        <w:t>CT-24 — hashSenha + verificarSenha — round-trip OK</w:t>
+      </w:r>
+    </w:p>
+    <w:tbl>
+      <w:tblPr>
+        <w:tblStyle w:val="LightGrid-Accent1"/>
+        <w:tblW w:type="auto" w:w="0"/>
+        <w:tblLook w:firstColumn="1" w:firstRow="1" w:lastColumn="0" w:lastRow="0" w:noHBand="0" w:noVBand="1" w:val="04A0"/>
+      </w:tblPr>
+      <w:tblGrid>
+        <w:gridCol w:w="4514"/>
+        <w:gridCol w:w="4514"/>
+      </w:tblGrid>
+      <w:tr>
+        <w:tc>
+          <w:tcPr>
+            <w:tcW w:type="dxa" w:w="4514"/>
+          </w:tcPr>
+          <w:p>
+            <w:r>
+              <w:rPr>
+                <w:b/>
+              </w:rPr>
+              <w:t>ID</w:t>
+            </w:r>
+          </w:p>
+        </w:tc>
+        <w:tc>
+          <w:tcPr>
+            <w:tcW w:type="dxa" w:w="4514"/>
+          </w:tcPr>
+          <w:p>
+            <w:r>
+              <w:t>CT-24</w:t>
+            </w:r>
+          </w:p>
+        </w:tc>
+      </w:tr>
+      <w:tr>
+        <w:tc>
+          <w:tcPr>
+            <w:tcW w:type="dxa" w:w="4514"/>
+          </w:tcPr>
+          <w:p>
+            <w:r>
+              <w:rPr>
+                <w:b/>
+              </w:rPr>
+              <w:t>Nome</w:t>
+            </w:r>
+          </w:p>
+        </w:tc>
+        <w:tc>
+          <w:tcPr>
+            <w:tcW w:type="dxa" w:w="4514"/>
+          </w:tcPr>
+          <w:p>
+            <w:r>
+              <w:t>hashSenha + verificarSenha — round-trip OK</w:t>
+            </w:r>
+          </w:p>
+        </w:tc>
+      </w:tr>
+      <w:tr>
+        <w:tc>
+          <w:tcPr>
+            <w:tcW w:type="dxa" w:w="4514"/>
+          </w:tcPr>
+          <w:p>
+            <w:r>
+              <w:rPr>
+                <w:b/>
+              </w:rPr>
+              <w:t>Objetivo</w:t>
+            </w:r>
+          </w:p>
+        </w:tc>
+        <w:tc>
+          <w:tcPr>
+            <w:tcW w:type="dxa" w:w="4514"/>
+          </w:tcPr>
+          <w:p>
+            <w:r>
+              <w:t>Garantir que uma senha hasheada com bcrypt valida positivamente quando comparada com o texto original.</w:t>
+            </w:r>
+          </w:p>
+        </w:tc>
+      </w:tr>
+      <w:tr>
+        <w:tc>
+          <w:tcPr>
+            <w:tcW w:type="dxa" w:w="4514"/>
+          </w:tcPr>
+          <w:p>
+            <w:r>
+              <w:rPr>
+                <w:b/>
+              </w:rPr>
+              <w:t>Pré-condições</w:t>
+            </w:r>
+          </w:p>
+        </w:tc>
+        <w:tc>
+          <w:tcPr>
+            <w:tcW w:type="dxa" w:w="4514"/>
+          </w:tcPr>
+          <w:p>
+            <w:r>
+              <w:t>bcryptjs instalado.</w:t>
+            </w:r>
+          </w:p>
+        </w:tc>
+      </w:tr>
+      <w:tr>
+        <w:tc>
+          <w:tcPr>
+            <w:tcW w:type="dxa" w:w="4514"/>
+          </w:tcPr>
+          <w:p>
+            <w:r>
+              <w:rPr>
+                <w:b/>
+              </w:rPr>
+              <w:t>Fluxo / Passos</w:t>
+            </w:r>
+          </w:p>
+        </w:tc>
+        <w:tc>
+          <w:tcPr>
+            <w:tcW w:type="dxa" w:w="4514"/>
+          </w:tcPr>
+          <w:p>
+            <w:r>
+              <w:t>Passos: hashSenha("MinhaSenh@Forte123") → hash; verificarSenha(original, hash).</w:t>
+            </w:r>
+          </w:p>
+        </w:tc>
+      </w:tr>
+      <w:tr>
+        <w:tc>
+          <w:tcPr>
+            <w:tcW w:type="dxa" w:w="4514"/>
+          </w:tcPr>
+          <w:p>
+            <w:r>
+              <w:rPr>
+                <w:b/>
+              </w:rPr>
+              <w:t>Resultado Esperado</w:t>
+            </w:r>
+          </w:p>
+        </w:tc>
+        <w:tc>
+          <w:tcPr>
+            <w:tcW w:type="dxa" w:w="4514"/>
+          </w:tcPr>
+          <w:p>
+            <w:r>
+              <w:t>Retorno true. Hash deve começar com $2a$10$ ou $2b$10$.</w:t>
+            </w:r>
+          </w:p>
+        </w:tc>
+      </w:tr>
+      <w:tr>
+        <w:tc>
+          <w:tcPr>
+            <w:tcW w:type="dxa" w:w="4514"/>
+          </w:tcPr>
+          <w:p>
+            <w:r>
+              <w:rPr>
+                <w:b/>
+              </w:rPr>
+              <w:t>Status</w:t>
+            </w:r>
+          </w:p>
+        </w:tc>
+        <w:tc>
+          <w:tcPr>
+            <w:tcW w:type="dxa" w:w="4514"/>
+          </w:tcPr>
+          <w:p>
+            <w:r>
+              <w:t>🟢 Aprovado</w:t>
+            </w:r>
+          </w:p>
+        </w:tc>
+      </w:tr>
+    </w:tbl>
+    <w:p/>
+    <w:p>
+      <w:r>
+        <w:rPr>
+          <w:b/>
+        </w:rPr>
+        <w:t>CT-25 — verificarSenha — recusa senha errada</w:t>
+      </w:r>
+    </w:p>
+    <w:tbl>
+      <w:tblPr>
+        <w:tblStyle w:val="LightGrid-Accent1"/>
+        <w:tblW w:type="auto" w:w="0"/>
+        <w:tblLook w:firstColumn="1" w:firstRow="1" w:lastColumn="0" w:lastRow="0" w:noHBand="0" w:noVBand="1" w:val="04A0"/>
+      </w:tblPr>
+      <w:tblGrid>
+        <w:gridCol w:w="4514"/>
+        <w:gridCol w:w="4514"/>
+      </w:tblGrid>
+      <w:tr>
+        <w:tc>
+          <w:tcPr>
+            <w:tcW w:type="dxa" w:w="4514"/>
+          </w:tcPr>
+          <w:p>
+            <w:r>
+              <w:rPr>
+                <w:b/>
+              </w:rPr>
+              <w:t>ID</w:t>
+            </w:r>
+          </w:p>
+        </w:tc>
+        <w:tc>
+          <w:tcPr>
+            <w:tcW w:type="dxa" w:w="4514"/>
+          </w:tcPr>
+          <w:p>
+            <w:r>
+              <w:t>CT-25</w:t>
+            </w:r>
+          </w:p>
+        </w:tc>
+      </w:tr>
+      <w:tr>
+        <w:tc>
+          <w:tcPr>
+            <w:tcW w:type="dxa" w:w="4514"/>
+          </w:tcPr>
+          <w:p>
+            <w:r>
+              <w:rPr>
+                <w:b/>
+              </w:rPr>
+              <w:t>Nome</w:t>
+            </w:r>
+          </w:p>
+        </w:tc>
+        <w:tc>
+          <w:tcPr>
+            <w:tcW w:type="dxa" w:w="4514"/>
+          </w:tcPr>
+          <w:p>
+            <w:r>
+              <w:t>verificarSenha — recusa senha errada</w:t>
+            </w:r>
+          </w:p>
+        </w:tc>
+      </w:tr>
+      <w:tr>
+        <w:tc>
+          <w:tcPr>
+            <w:tcW w:type="dxa" w:w="4514"/>
+          </w:tcPr>
+          <w:p>
+            <w:r>
+              <w:rPr>
+                <w:b/>
+              </w:rPr>
+              <w:t>Objetivo</w:t>
+            </w:r>
+          </w:p>
+        </w:tc>
+        <w:tc>
+          <w:tcPr>
+            <w:tcW w:type="dxa" w:w="4514"/>
+          </w:tcPr>
+          <w:p>
+            <w:r>
+              <w:t>Garantir que comparar texto diferente do original retorna false.</w:t>
+            </w:r>
+          </w:p>
+        </w:tc>
+      </w:tr>
+      <w:tr>
+        <w:tc>
+          <w:tcPr>
+            <w:tcW w:type="dxa" w:w="4514"/>
+          </w:tcPr>
+          <w:p>
+            <w:r>
+              <w:rPr>
+                <w:b/>
+              </w:rPr>
+              <w:t>Pré-condições</w:t>
+            </w:r>
+          </w:p>
+        </w:tc>
+        <w:tc>
+          <w:tcPr>
+            <w:tcW w:type="dxa" w:w="4514"/>
+          </w:tcPr>
+          <w:p>
+            <w:r>
+              <w:t>Hash de senha conhecido.</w:t>
+            </w:r>
+          </w:p>
+        </w:tc>
+      </w:tr>
+      <w:tr>
+        <w:tc>
+          <w:tcPr>
+            <w:tcW w:type="dxa" w:w="4514"/>
+          </w:tcPr>
+          <w:p>
+            <w:r>
+              <w:rPr>
+                <w:b/>
+              </w:rPr>
+              <w:t>Fluxo / Passos</w:t>
+            </w:r>
+          </w:p>
+        </w:tc>
+        <w:tc>
+          <w:tcPr>
+            <w:tcW w:type="dxa" w:w="4514"/>
+          </w:tcPr>
+          <w:p>
+            <w:r>
+              <w:t>Passos: verificarSenha("senhaErrada", hashDeOutraSenha).</w:t>
+            </w:r>
+          </w:p>
+        </w:tc>
+      </w:tr>
+      <w:tr>
+        <w:tc>
+          <w:tcPr>
+            <w:tcW w:type="dxa" w:w="4514"/>
+          </w:tcPr>
+          <w:p>
+            <w:r>
+              <w:rPr>
+                <w:b/>
+              </w:rPr>
+              <w:t>Resultado Esperado</w:t>
+            </w:r>
+          </w:p>
+        </w:tc>
+        <w:tc>
+          <w:tcPr>
+            <w:tcW w:type="dxa" w:w="4514"/>
+          </w:tcPr>
+          <w:p>
+            <w:r>
+              <w:t>Retorno false.</w:t>
+            </w:r>
+          </w:p>
+        </w:tc>
+      </w:tr>
+      <w:tr>
+        <w:tc>
+          <w:tcPr>
+            <w:tcW w:type="dxa" w:w="4514"/>
+          </w:tcPr>
+          <w:p>
+            <w:r>
+              <w:rPr>
+                <w:b/>
+              </w:rPr>
+              <w:t>Status</w:t>
+            </w:r>
+          </w:p>
+        </w:tc>
+        <w:tc>
+          <w:tcPr>
+            <w:tcW w:type="dxa" w:w="4514"/>
+          </w:tcPr>
+          <w:p>
+            <w:r>
+              <w:t>🟢 Aprovado</w:t>
+            </w:r>
+          </w:p>
+        </w:tc>
+      </w:tr>
+    </w:tbl>
+    <w:p/>
+    <w:p>
+      <w:r>
+        <w:rPr>
+          <w:b/>
+        </w:rPr>
+        <w:t>CT-26 — validateComentarioTexto — limites min/max</w:t>
+      </w:r>
+    </w:p>
+    <w:tbl>
+      <w:tblPr>
+        <w:tblStyle w:val="LightGrid-Accent1"/>
+        <w:tblW w:type="auto" w:w="0"/>
+        <w:tblLook w:firstColumn="1" w:firstRow="1" w:lastColumn="0" w:lastRow="0" w:noHBand="0" w:noVBand="1" w:val="04A0"/>
+      </w:tblPr>
+      <w:tblGrid>
+        <w:gridCol w:w="4514"/>
+        <w:gridCol w:w="4514"/>
+      </w:tblGrid>
+      <w:tr>
+        <w:tc>
+          <w:tcPr>
+            <w:tcW w:type="dxa" w:w="4514"/>
+          </w:tcPr>
+          <w:p>
+            <w:r>
+              <w:rPr>
+                <w:b/>
+              </w:rPr>
+              <w:t>ID</w:t>
+            </w:r>
+          </w:p>
+        </w:tc>
+        <w:tc>
+          <w:tcPr>
+            <w:tcW w:type="dxa" w:w="4514"/>
+          </w:tcPr>
+          <w:p>
+            <w:r>
+              <w:t>CT-26</w:t>
+            </w:r>
+          </w:p>
+        </w:tc>
+      </w:tr>
+      <w:tr>
+        <w:tc>
+          <w:tcPr>
+            <w:tcW w:type="dxa" w:w="4514"/>
+          </w:tcPr>
+          <w:p>
+            <w:r>
+              <w:rPr>
+                <w:b/>
+              </w:rPr>
+              <w:t>Nome</w:t>
+            </w:r>
+          </w:p>
+        </w:tc>
+        <w:tc>
+          <w:tcPr>
+            <w:tcW w:type="dxa" w:w="4514"/>
+          </w:tcPr>
+          <w:p>
+            <w:r>
+              <w:t>validateComentarioTexto — limites min/max</w:t>
+            </w:r>
+          </w:p>
+        </w:tc>
+      </w:tr>
+      <w:tr>
+        <w:tc>
+          <w:tcPr>
+            <w:tcW w:type="dxa" w:w="4514"/>
+          </w:tcPr>
+          <w:p>
+            <w:r>
+              <w:rPr>
+                <w:b/>
+              </w:rPr>
+              <w:t>Objetivo</w:t>
+            </w:r>
+          </w:p>
+        </w:tc>
+        <w:tc>
+          <w:tcPr>
+            <w:tcW w:type="dxa" w:w="4514"/>
+          </w:tcPr>
+          <w:p>
+            <w:r>
+              <w:t>Garantir aceitação no limite válido (1 a 1000 chars) e rejeição fora dele.</w:t>
+            </w:r>
+          </w:p>
+        </w:tc>
+      </w:tr>
+      <w:tr>
+        <w:tc>
+          <w:tcPr>
+            <w:tcW w:type="dxa" w:w="4514"/>
+          </w:tcPr>
+          <w:p>
+            <w:r>
+              <w:rPr>
+                <w:b/>
+              </w:rPr>
+              <w:t>Pré-condições</w:t>
+            </w:r>
+          </w:p>
+        </w:tc>
+        <w:tc>
+          <w:tcPr>
+            <w:tcW w:type="dxa" w:w="4514"/>
+          </w:tcPr>
+          <w:p>
+            <w:r>
+              <w:t>Validador disponível.</w:t>
+            </w:r>
+          </w:p>
+        </w:tc>
+      </w:tr>
+      <w:tr>
+        <w:tc>
+          <w:tcPr>
+            <w:tcW w:type="dxa" w:w="4514"/>
+          </w:tcPr>
+          <w:p>
+            <w:r>
+              <w:rPr>
+                <w:b/>
+              </w:rPr>
+              <w:t>Fluxo / Passos</w:t>
+            </w:r>
+          </w:p>
+        </w:tc>
+        <w:tc>
+          <w:tcPr>
+            <w:tcW w:type="dxa" w:w="4514"/>
+          </w:tcPr>
+          <w:p>
+            <w:r>
+              <w:t>Casos: "" → erro vazio; "   " → erro vazio; "a"*1000 → null; "a"*1001 → erro tamanho.</w:t>
+            </w:r>
+          </w:p>
+        </w:tc>
+      </w:tr>
+      <w:tr>
+        <w:tc>
+          <w:tcPr>
+            <w:tcW w:type="dxa" w:w="4514"/>
+          </w:tcPr>
+          <w:p>
+            <w:r>
+              <w:rPr>
+                <w:b/>
+              </w:rPr>
+              <w:t>Resultado Esperado</w:t>
+            </w:r>
+          </w:p>
+        </w:tc>
+        <w:tc>
+          <w:tcPr>
+            <w:tcW w:type="dxa" w:w="4514"/>
+          </w:tcPr>
+          <w:p>
+            <w:r>
+              <w:t>Mensagens de erro corretas para os casos inválidos; null para os válidos.</w:t>
+            </w:r>
+          </w:p>
+        </w:tc>
+      </w:tr>
+      <w:tr>
+        <w:tc>
+          <w:tcPr>
+            <w:tcW w:type="dxa" w:w="4514"/>
+          </w:tcPr>
+          <w:p>
+            <w:r>
+              <w:rPr>
+                <w:b/>
+              </w:rPr>
+              <w:t>Status</w:t>
+            </w:r>
+          </w:p>
+        </w:tc>
+        <w:tc>
+          <w:tcPr>
+            <w:tcW w:type="dxa" w:w="4514"/>
+          </w:tcPr>
+          <w:p>
+            <w:r>
+              <w:t>🟢 Aprovado</w:t>
+            </w:r>
+          </w:p>
+        </w:tc>
+      </w:tr>
+    </w:tbl>
+    <w:p/>
+    <w:p>
+      <w:r>
+        <w:rPr>
+          <w:b/>
+        </w:rPr>
+        <w:t>CT-27 — createUser — transação atômica usuario + jogador</w:t>
+      </w:r>
+    </w:p>
+    <w:tbl>
+      <w:tblPr>
+        <w:tblStyle w:val="LightGrid-Accent1"/>
+        <w:tblW w:type="auto" w:w="0"/>
+        <w:tblLook w:firstColumn="1" w:firstRow="1" w:lastColumn="0" w:lastRow="0" w:noHBand="0" w:noVBand="1" w:val="04A0"/>
+      </w:tblPr>
+      <w:tblGrid>
+        <w:gridCol w:w="4514"/>
+        <w:gridCol w:w="4514"/>
+      </w:tblGrid>
+      <w:tr>
+        <w:tc>
+          <w:tcPr>
+            <w:tcW w:type="dxa" w:w="4514"/>
+          </w:tcPr>
+          <w:p>
+            <w:r>
+              <w:rPr>
+                <w:b/>
+              </w:rPr>
+              <w:t>ID</w:t>
+            </w:r>
+          </w:p>
+        </w:tc>
+        <w:tc>
+          <w:tcPr>
+            <w:tcW w:type="dxa" w:w="4514"/>
+          </w:tcPr>
+          <w:p>
+            <w:r>
+              <w:t>CT-27</w:t>
+            </w:r>
+          </w:p>
+        </w:tc>
+      </w:tr>
+      <w:tr>
+        <w:tc>
+          <w:tcPr>
+            <w:tcW w:type="dxa" w:w="4514"/>
+          </w:tcPr>
+          <w:p>
+            <w:r>
+              <w:rPr>
+                <w:b/>
+              </w:rPr>
+              <w:t>Nome</w:t>
+            </w:r>
+          </w:p>
+        </w:tc>
+        <w:tc>
+          <w:tcPr>
+            <w:tcW w:type="dxa" w:w="4514"/>
+          </w:tcPr>
+          <w:p>
+            <w:r>
+              <w:t>createUser — transação atômica usuario + jogador</w:t>
+            </w:r>
+          </w:p>
+        </w:tc>
+      </w:tr>
+      <w:tr>
+        <w:tc>
+          <w:tcPr>
+            <w:tcW w:type="dxa" w:w="4514"/>
+          </w:tcPr>
+          <w:p>
+            <w:r>
+              <w:rPr>
+                <w:b/>
+              </w:rPr>
+              <w:t>Objetivo</w:t>
+            </w:r>
+          </w:p>
+        </w:tc>
+        <w:tc>
+          <w:tcPr>
+            <w:tcW w:type="dxa" w:w="4514"/>
+          </w:tcPr>
+          <w:p>
+            <w:r>
+              <w:t>Verificar que /lib/users.createUser insere a linha em "usuario" e a correspondente em "jogador" na mesma transação.</w:t>
+            </w:r>
+          </w:p>
+        </w:tc>
+      </w:tr>
+      <w:tr>
+        <w:tc>
+          <w:tcPr>
+            <w:tcW w:type="dxa" w:w="4514"/>
+          </w:tcPr>
+          <w:p>
+            <w:r>
+              <w:rPr>
+                <w:b/>
+              </w:rPr>
+              <w:t>Pré-condições</w:t>
+            </w:r>
+          </w:p>
+        </w:tc>
+        <w:tc>
+          <w:tcPr>
+            <w:tcW w:type="dxa" w:w="4514"/>
+          </w:tcPr>
+          <w:p>
+            <w:r>
+              <w:t>BancoVersao2034_test criado e com schema aplicado. SESSION_SECRET no .env.local.</w:t>
+            </w:r>
+          </w:p>
+        </w:tc>
+      </w:tr>
+      <w:tr>
+        <w:tc>
+          <w:tcPr>
+            <w:tcW w:type="dxa" w:w="4514"/>
+          </w:tcPr>
+          <w:p>
+            <w:r>
+              <w:rPr>
+                <w:b/>
+              </w:rPr>
+              <w:t>Fluxo / Passos</w:t>
+            </w:r>
+          </w:p>
+        </w:tc>
+        <w:tc>
+          <w:tcPr>
+            <w:tcW w:type="dxa" w:w="4514"/>
+          </w:tcPr>
+          <w:p>
+            <w:r>
+              <w:t>Passos: createUser({nome, sobrenome, username, email, senha}); consultar jogador.usuario_id.</w:t>
+            </w:r>
+          </w:p>
+        </w:tc>
+      </w:tr>
+      <w:tr>
+        <w:tc>
+          <w:tcPr>
+            <w:tcW w:type="dxa" w:w="4514"/>
+          </w:tcPr>
+          <w:p>
+            <w:r>
+              <w:rPr>
+                <w:b/>
+              </w:rPr>
+              <w:t>Resultado Esperado</w:t>
+            </w:r>
+          </w:p>
+        </w:tc>
+        <w:tc>
+          <w:tcPr>
+            <w:tcW w:type="dxa" w:w="4514"/>
+          </w:tcPr>
+          <w:p>
+            <w:r>
+              <w:t>usuario.id deve ser UUID. jogador.usuario_id deve referenciar usuario.id. senha_hash deve ser hash bcrypt.</w:t>
+            </w:r>
+          </w:p>
+        </w:tc>
+      </w:tr>
+      <w:tr>
+        <w:tc>
+          <w:tcPr>
+            <w:tcW w:type="dxa" w:w="4514"/>
+          </w:tcPr>
+          <w:p>
+            <w:r>
+              <w:rPr>
+                <w:b/>
+              </w:rPr>
+              <w:t>Status</w:t>
+            </w:r>
+          </w:p>
+        </w:tc>
+        <w:tc>
+          <w:tcPr>
+            <w:tcW w:type="dxa" w:w="4514"/>
+          </w:tcPr>
+          <w:p>
+            <w:r>
+              <w:t>🟢 Aprovado</w:t>
+            </w:r>
+          </w:p>
+        </w:tc>
+      </w:tr>
+    </w:tbl>
+    <w:p/>
+    <w:p>
+      <w:r>
+        <w:rPr>
+          <w:b/>
+        </w:rPr>
+        <w:t>CT-28 — createUser duplicado dispara 23505</w:t>
+      </w:r>
+    </w:p>
+    <w:tbl>
+      <w:tblPr>
+        <w:tblStyle w:val="LightGrid-Accent1"/>
+        <w:tblW w:type="auto" w:w="0"/>
+        <w:tblLook w:firstColumn="1" w:firstRow="1" w:lastColumn="0" w:lastRow="0" w:noHBand="0" w:noVBand="1" w:val="04A0"/>
+      </w:tblPr>
+      <w:tblGrid>
+        <w:gridCol w:w="4514"/>
+        <w:gridCol w:w="4514"/>
+      </w:tblGrid>
+      <w:tr>
+        <w:tc>
+          <w:tcPr>
+            <w:tcW w:type="dxa" w:w="4514"/>
+          </w:tcPr>
+          <w:p>
+            <w:r>
+              <w:rPr>
+                <w:b/>
+              </w:rPr>
+              <w:t>ID</w:t>
+            </w:r>
+          </w:p>
+        </w:tc>
+        <w:tc>
+          <w:tcPr>
+            <w:tcW w:type="dxa" w:w="4514"/>
+          </w:tcPr>
+          <w:p>
+            <w:r>
+              <w:t>CT-28</w:t>
+            </w:r>
+          </w:p>
+        </w:tc>
+      </w:tr>
+      <w:tr>
+        <w:tc>
+          <w:tcPr>
+            <w:tcW w:type="dxa" w:w="4514"/>
+          </w:tcPr>
+          <w:p>
+            <w:r>
+              <w:rPr>
+                <w:b/>
+              </w:rPr>
+              <w:t>Nome</w:t>
+            </w:r>
+          </w:p>
+        </w:tc>
+        <w:tc>
+          <w:tcPr>
+            <w:tcW w:type="dxa" w:w="4514"/>
+          </w:tcPr>
+          <w:p>
+            <w:r>
+              <w:t>createUser duplicado dispara 23505</w:t>
+            </w:r>
+          </w:p>
+        </w:tc>
+      </w:tr>
+      <w:tr>
+        <w:tc>
+          <w:tcPr>
+            <w:tcW w:type="dxa" w:w="4514"/>
+          </w:tcPr>
+          <w:p>
+            <w:r>
+              <w:rPr>
+                <w:b/>
+              </w:rPr>
+              <w:t>Objetivo</w:t>
+            </w:r>
+          </w:p>
+        </w:tc>
+        <w:tc>
+          <w:tcPr>
+            <w:tcW w:type="dxa" w:w="4514"/>
+          </w:tcPr>
+          <w:p>
+            <w:r>
+              <w:t>Garantir que tentar criar dois usuários com mesmo username falha com erro UNIQUE do Postgres.</w:t>
+            </w:r>
+          </w:p>
+        </w:tc>
+      </w:tr>
+      <w:tr>
+        <w:tc>
+          <w:tcPr>
+            <w:tcW w:type="dxa" w:w="4514"/>
+          </w:tcPr>
+          <w:p>
+            <w:r>
+              <w:rPr>
+                <w:b/>
+              </w:rPr>
+              <w:t>Pré-condições</w:t>
+            </w:r>
+          </w:p>
+        </w:tc>
+        <w:tc>
+          <w:tcPr>
+            <w:tcW w:type="dxa" w:w="4514"/>
+          </w:tcPr>
+          <w:p>
+            <w:r>
+              <w:t>Banco de teste com schema; primeiro createUser concluído.</w:t>
+            </w:r>
+          </w:p>
+        </w:tc>
+      </w:tr>
+      <w:tr>
+        <w:tc>
+          <w:tcPr>
+            <w:tcW w:type="dxa" w:w="4514"/>
+          </w:tcPr>
+          <w:p>
+            <w:r>
+              <w:rPr>
+                <w:b/>
+              </w:rPr>
+              <w:t>Fluxo / Passos</w:t>
+            </w:r>
+          </w:p>
+        </w:tc>
+        <w:tc>
+          <w:tcPr>
+            <w:tcW w:type="dxa" w:w="4514"/>
+          </w:tcPr>
+          <w:p>
+            <w:r>
+              <w:t>Passos: createUser com username já em uso.</w:t>
+            </w:r>
+          </w:p>
+        </w:tc>
+      </w:tr>
+      <w:tr>
+        <w:tc>
+          <w:tcPr>
+            <w:tcW w:type="dxa" w:w="4514"/>
+          </w:tcPr>
+          <w:p>
+            <w:r>
+              <w:rPr>
+                <w:b/>
+              </w:rPr>
+              <w:t>Resultado Esperado</w:t>
+            </w:r>
+          </w:p>
+        </w:tc>
+        <w:tc>
+          <w:tcPr>
+            <w:tcW w:type="dxa" w:w="4514"/>
+          </w:tcPr>
+          <w:p>
+            <w:r>
+              <w:t>A Promise deve rejeitar com objeto que tenha .code === "23505".</w:t>
+            </w:r>
+          </w:p>
+        </w:tc>
+      </w:tr>
+      <w:tr>
+        <w:tc>
+          <w:tcPr>
+            <w:tcW w:type="dxa" w:w="4514"/>
+          </w:tcPr>
+          <w:p>
+            <w:r>
+              <w:rPr>
+                <w:b/>
+              </w:rPr>
+              <w:t>Status</w:t>
+            </w:r>
+          </w:p>
+        </w:tc>
+        <w:tc>
+          <w:tcPr>
+            <w:tcW w:type="dxa" w:w="4514"/>
+          </w:tcPr>
+          <w:p>
+            <w:r>
+              <w:t>🟢 Aprovado</w:t>
+            </w:r>
+          </w:p>
+        </w:tc>
+      </w:tr>
+    </w:tbl>
+    <w:p/>
+    <w:p>
+      <w:r>
+        <w:rPr>
+          <w:b/>
+        </w:rPr>
+        <w:t>CT-29 — deleteUser — ON DELETE CASCADE em jogador</w:t>
+      </w:r>
+    </w:p>
+    <w:tbl>
+      <w:tblPr>
+        <w:tblStyle w:val="LightGrid-Accent1"/>
+        <w:tblW w:type="auto" w:w="0"/>
+        <w:tblLook w:firstColumn="1" w:firstRow="1" w:lastColumn="0" w:lastRow="0" w:noHBand="0" w:noVBand="1" w:val="04A0"/>
+      </w:tblPr>
+      <w:tblGrid>
+        <w:gridCol w:w="4514"/>
+        <w:gridCol w:w="4514"/>
+      </w:tblGrid>
+      <w:tr>
+        <w:tc>
+          <w:tcPr>
+            <w:tcW w:type="dxa" w:w="4514"/>
+          </w:tcPr>
+          <w:p>
+            <w:r>
+              <w:rPr>
+                <w:b/>
+              </w:rPr>
+              <w:t>ID</w:t>
+            </w:r>
+          </w:p>
+        </w:tc>
+        <w:tc>
+          <w:tcPr>
+            <w:tcW w:type="dxa" w:w="4514"/>
+          </w:tcPr>
+          <w:p>
+            <w:r>
+              <w:t>CT-29</w:t>
+            </w:r>
+          </w:p>
+        </w:tc>
+      </w:tr>
+      <w:tr>
+        <w:tc>
+          <w:tcPr>
+            <w:tcW w:type="dxa" w:w="4514"/>
+          </w:tcPr>
+          <w:p>
+            <w:r>
+              <w:rPr>
+                <w:b/>
+              </w:rPr>
+              <w:t>Nome</w:t>
+            </w:r>
+          </w:p>
+        </w:tc>
+        <w:tc>
+          <w:tcPr>
+            <w:tcW w:type="dxa" w:w="4514"/>
+          </w:tcPr>
+          <w:p>
+            <w:r>
+              <w:t>deleteUser — ON DELETE CASCADE em jogador</w:t>
+            </w:r>
+          </w:p>
+        </w:tc>
+      </w:tr>
+      <w:tr>
+        <w:tc>
+          <w:tcPr>
+            <w:tcW w:type="dxa" w:w="4514"/>
+          </w:tcPr>
+          <w:p>
+            <w:r>
+              <w:rPr>
+                <w:b/>
+              </w:rPr>
+              <w:t>Objetivo</w:t>
+            </w:r>
+          </w:p>
+        </w:tc>
+        <w:tc>
+          <w:tcPr>
+            <w:tcW w:type="dxa" w:w="4514"/>
+          </w:tcPr>
+          <w:p>
+            <w:r>
+              <w:t>Verificar que apagar o usuário remove automaticamente o jogador (FK CASCADE).</w:t>
+            </w:r>
+          </w:p>
+        </w:tc>
+      </w:tr>
+      <w:tr>
+        <w:tc>
+          <w:tcPr>
+            <w:tcW w:type="dxa" w:w="4514"/>
+          </w:tcPr>
+          <w:p>
+            <w:r>
+              <w:rPr>
+                <w:b/>
+              </w:rPr>
+              <w:t>Pré-condições</w:t>
+            </w:r>
+          </w:p>
+        </w:tc>
+        <w:tc>
+          <w:tcPr>
+            <w:tcW w:type="dxa" w:w="4514"/>
+          </w:tcPr>
+          <w:p>
+            <w:r>
+              <w:t>Banco de teste com schema; usuário e jogador criados.</w:t>
+            </w:r>
+          </w:p>
+        </w:tc>
+      </w:tr>
+      <w:tr>
+        <w:tc>
+          <w:tcPr>
+            <w:tcW w:type="dxa" w:w="4514"/>
+          </w:tcPr>
+          <w:p>
+            <w:r>
+              <w:rPr>
+                <w:b/>
+              </w:rPr>
+              <w:t>Fluxo / Passos</w:t>
+            </w:r>
+          </w:p>
+        </w:tc>
+        <w:tc>
+          <w:tcPr>
+            <w:tcW w:type="dxa" w:w="4514"/>
+          </w:tcPr>
+          <w:p>
+            <w:r>
+              <w:t>Passos: deleteUser(uuid); consultar jogador.</w:t>
+            </w:r>
+          </w:p>
+        </w:tc>
+      </w:tr>
+      <w:tr>
+        <w:tc>
+          <w:tcPr>
+            <w:tcW w:type="dxa" w:w="4514"/>
+          </w:tcPr>
+          <w:p>
+            <w:r>
+              <w:rPr>
+                <w:b/>
+              </w:rPr>
+              <w:t>Resultado Esperado</w:t>
+            </w:r>
+          </w:p>
+        </w:tc>
+        <w:tc>
+          <w:tcPr>
+            <w:tcW w:type="dxa" w:w="4514"/>
+          </w:tcPr>
+          <w:p>
+            <w:r>
+              <w:t>rowCount em jogador deve ser 0.</w:t>
+            </w:r>
+          </w:p>
+        </w:tc>
+      </w:tr>
+      <w:tr>
+        <w:tc>
+          <w:tcPr>
+            <w:tcW w:type="dxa" w:w="4514"/>
+          </w:tcPr>
+          <w:p>
+            <w:r>
+              <w:rPr>
+                <w:b/>
+              </w:rPr>
+              <w:t>Status</w:t>
+            </w:r>
+          </w:p>
+        </w:tc>
+        <w:tc>
+          <w:tcPr>
+            <w:tcW w:type="dxa" w:w="4514"/>
+          </w:tcPr>
+          <w:p>
+            <w:r>
+              <w:t>🟢 Aprovado</w:t>
+            </w:r>
+          </w:p>
+        </w:tc>
+      </w:tr>
+    </w:tbl>
+    <w:p/>
+    <w:p>
+      <w:r>
+        <w:rPr>
+          <w:b/>
+        </w:rPr>
+        <w:t>CT-30 — CRUD Comentário — pertenceAoLeitor é por jogador</w:t>
+      </w:r>
+    </w:p>
+    <w:tbl>
+      <w:tblPr>
+        <w:tblStyle w:val="LightGrid-Accent1"/>
+        <w:tblW w:type="auto" w:w="0"/>
+        <w:tblLook w:firstColumn="1" w:firstRow="1" w:lastColumn="0" w:lastRow="0" w:noHBand="0" w:noVBand="1" w:val="04A0"/>
+      </w:tblPr>
+      <w:tblGrid>
+        <w:gridCol w:w="4514"/>
+        <w:gridCol w:w="4514"/>
+      </w:tblGrid>
+      <w:tr>
+        <w:tc>
+          <w:tcPr>
+            <w:tcW w:type="dxa" w:w="4514"/>
+          </w:tcPr>
+          <w:p>
+            <w:r>
+              <w:rPr>
+                <w:b/>
+              </w:rPr>
+              <w:t>ID</w:t>
+            </w:r>
+          </w:p>
+        </w:tc>
+        <w:tc>
+          <w:tcPr>
+            <w:tcW w:type="dxa" w:w="4514"/>
+          </w:tcPr>
+          <w:p>
+            <w:r>
+              <w:t>CT-30</w:t>
+            </w:r>
+          </w:p>
+        </w:tc>
+      </w:tr>
+      <w:tr>
+        <w:tc>
+          <w:tcPr>
+            <w:tcW w:type="dxa" w:w="4514"/>
+          </w:tcPr>
+          <w:p>
+            <w:r>
+              <w:rPr>
+                <w:b/>
+              </w:rPr>
+              <w:t>Nome</w:t>
+            </w:r>
+          </w:p>
+        </w:tc>
+        <w:tc>
+          <w:tcPr>
+            <w:tcW w:type="dxa" w:w="4514"/>
+          </w:tcPr>
+          <w:p>
+            <w:r>
+              <w:t>CRUD Comentário — pertenceAoLeitor é por jogador</w:t>
+            </w:r>
+          </w:p>
+        </w:tc>
+      </w:tr>
+      <w:tr>
+        <w:tc>
+          <w:tcPr>
+            <w:tcW w:type="dxa" w:w="4514"/>
+          </w:tcPr>
+          <w:p>
+            <w:r>
+              <w:rPr>
+                <w:b/>
+              </w:rPr>
+              <w:t>Objetivo</w:t>
+            </w:r>
+          </w:p>
+        </w:tc>
+        <w:tc>
+          <w:tcPr>
+            <w:tcW w:type="dxa" w:w="4514"/>
+          </w:tcPr>
+          <w:p>
+            <w:r>
+              <w:t>Garantir que listByPuzzle só marca pertenceAoLeitor=true para comentários cujo jogador_id bate com o do leitor.</w:t>
+            </w:r>
+          </w:p>
+        </w:tc>
+      </w:tr>
+      <w:tr>
+        <w:tc>
+          <w:tcPr>
+            <w:tcW w:type="dxa" w:w="4514"/>
+          </w:tcPr>
+          <w:p>
+            <w:r>
+              <w:rPr>
+                <w:b/>
+              </w:rPr>
+              <w:t>Pré-condições</w:t>
+            </w:r>
+          </w:p>
+        </w:tc>
+        <w:tc>
+          <w:tcPr>
+            <w:tcW w:type="dxa" w:w="4514"/>
+          </w:tcPr>
+          <w:p>
+            <w:r>
+              <w:t>Banco de teste; dois usuários com comentários no mesmo puzzle.</w:t>
+            </w:r>
+          </w:p>
+        </w:tc>
+      </w:tr>
+      <w:tr>
+        <w:tc>
+          <w:tcPr>
+            <w:tcW w:type="dxa" w:w="4514"/>
+          </w:tcPr>
+          <w:p>
+            <w:r>
+              <w:rPr>
+                <w:b/>
+              </w:rPr>
+              <w:t>Fluxo / Passos</w:t>
+            </w:r>
+          </w:p>
+        </w:tc>
+        <w:tc>
+          <w:tcPr>
+            <w:tcW w:type="dxa" w:w="4514"/>
+          </w:tcPr>
+          <w:p>
+            <w:r>
+              <w:t>Passos: alice e bob criam comentários em "p1"; alice lista a thread.</w:t>
+            </w:r>
+          </w:p>
+        </w:tc>
+      </w:tr>
+      <w:tr>
+        <w:tc>
+          <w:tcPr>
+            <w:tcW w:type="dxa" w:w="4514"/>
+          </w:tcPr>
+          <w:p>
+            <w:r>
+              <w:rPr>
+                <w:b/>
+              </w:rPr>
+              <w:t>Resultado Esperado</w:t>
+            </w:r>
+          </w:p>
+        </w:tc>
+        <w:tc>
+          <w:tcPr>
+            <w:tcW w:type="dxa" w:w="4514"/>
+          </w:tcPr>
+          <w:p>
+            <w:r>
+              <w:t>Para alice, seu próprio comentário tem pertenceAoLeitor=true; o do bob, false.</w:t>
+            </w:r>
+          </w:p>
+        </w:tc>
+      </w:tr>
+      <w:tr>
+        <w:tc>
+          <w:tcPr>
+            <w:tcW w:type="dxa" w:w="4514"/>
+          </w:tcPr>
+          <w:p>
+            <w:r>
+              <w:rPr>
+                <w:b/>
+              </w:rPr>
+              <w:t>Status</w:t>
+            </w:r>
+          </w:p>
+        </w:tc>
+        <w:tc>
+          <w:tcPr>
+            <w:tcW w:type="dxa" w:w="4514"/>
+          </w:tcPr>
+          <w:p>
+            <w:r>
+              <w:t>🟢 Aprovado</w:t>
+            </w:r>
+          </w:p>
+        </w:tc>
+      </w:tr>
+    </w:tbl>
+    <w:p/>
+    <w:p>
+      <w:r>
+        <w:rPr>
+          <w:b/>
+        </w:rPr>
+        <w:t>CT-31 — updateComentario — bloqueia edição de outro autor</w:t>
+      </w:r>
+    </w:p>
+    <w:tbl>
+      <w:tblPr>
+        <w:tblStyle w:val="LightGrid-Accent1"/>
+        <w:tblW w:type="auto" w:w="0"/>
+        <w:tblLook w:firstColumn="1" w:firstRow="1" w:lastColumn="0" w:lastRow="0" w:noHBand="0" w:noVBand="1" w:val="04A0"/>
+      </w:tblPr>
+      <w:tblGrid>
+        <w:gridCol w:w="4514"/>
+        <w:gridCol w:w="4514"/>
+      </w:tblGrid>
+      <w:tr>
+        <w:tc>
+          <w:tcPr>
+            <w:tcW w:type="dxa" w:w="4514"/>
+          </w:tcPr>
+          <w:p>
+            <w:r>
+              <w:rPr>
+                <w:b/>
+              </w:rPr>
+              <w:t>ID</w:t>
+            </w:r>
+          </w:p>
+        </w:tc>
+        <w:tc>
+          <w:tcPr>
+            <w:tcW w:type="dxa" w:w="4514"/>
+          </w:tcPr>
+          <w:p>
+            <w:r>
+              <w:t>CT-31</w:t>
+            </w:r>
+          </w:p>
+        </w:tc>
+      </w:tr>
+      <w:tr>
+        <w:tc>
+          <w:tcPr>
+            <w:tcW w:type="dxa" w:w="4514"/>
+          </w:tcPr>
+          <w:p>
+            <w:r>
+              <w:rPr>
+                <w:b/>
+              </w:rPr>
+              <w:t>Nome</w:t>
+            </w:r>
+          </w:p>
+        </w:tc>
+        <w:tc>
+          <w:tcPr>
+            <w:tcW w:type="dxa" w:w="4514"/>
+          </w:tcPr>
+          <w:p>
+            <w:r>
+              <w:t>updateComentario — bloqueia edição de outro autor</w:t>
+            </w:r>
+          </w:p>
+        </w:tc>
+      </w:tr>
+      <w:tr>
+        <w:tc>
+          <w:tcPr>
+            <w:tcW w:type="dxa" w:w="4514"/>
+          </w:tcPr>
+          <w:p>
+            <w:r>
+              <w:rPr>
+                <w:b/>
+              </w:rPr>
+              <w:t>Objetivo</w:t>
+            </w:r>
+          </w:p>
+        </w:tc>
+        <w:tc>
+          <w:tcPr>
+            <w:tcW w:type="dxa" w:w="4514"/>
+          </w:tcPr>
+          <w:p>
+            <w:r>
+              <w:t>Garantir que tentar editar comentário alheio retorna null sem alterar dados.</w:t>
+            </w:r>
+          </w:p>
+        </w:tc>
+      </w:tr>
+      <w:tr>
+        <w:tc>
+          <w:tcPr>
+            <w:tcW w:type="dxa" w:w="4514"/>
+          </w:tcPr>
+          <w:p>
+            <w:r>
+              <w:rPr>
+                <w:b/>
+              </w:rPr>
+              <w:t>Pré-condições</w:t>
+            </w:r>
+          </w:p>
+        </w:tc>
+        <w:tc>
+          <w:tcPr>
+            <w:tcW w:type="dxa" w:w="4514"/>
+          </w:tcPr>
+          <w:p>
+            <w:r>
+              <w:t>Banco; alice cria comentário; bob é outro usuário válido.</w:t>
+            </w:r>
+          </w:p>
+        </w:tc>
+      </w:tr>
+      <w:tr>
+        <w:tc>
+          <w:tcPr>
+            <w:tcW w:type="dxa" w:w="4514"/>
+          </w:tcPr>
+          <w:p>
+            <w:r>
+              <w:rPr>
+                <w:b/>
+              </w:rPr>
+              <w:t>Fluxo / Passos</w:t>
+            </w:r>
+          </w:p>
+        </w:tc>
+        <w:tc>
+          <w:tcPr>
+            <w:tcW w:type="dxa" w:w="4514"/>
+          </w:tcPr>
+          <w:p>
+            <w:r>
+              <w:t>Passos: updateComentario(idDoAlice, bobId, "hackeado").</w:t>
+            </w:r>
+          </w:p>
+        </w:tc>
+      </w:tr>
+      <w:tr>
+        <w:tc>
+          <w:tcPr>
+            <w:tcW w:type="dxa" w:w="4514"/>
+          </w:tcPr>
+          <w:p>
+            <w:r>
+              <w:rPr>
+                <w:b/>
+              </w:rPr>
+              <w:t>Resultado Esperado</w:t>
+            </w:r>
+          </w:p>
+        </w:tc>
+        <w:tc>
+          <w:tcPr>
+            <w:tcW w:type="dxa" w:w="4514"/>
+          </w:tcPr>
+          <w:p>
+            <w:r>
+              <w:t>Retorno null. Texto persistido continua o original.</w:t>
+            </w:r>
+          </w:p>
+        </w:tc>
+      </w:tr>
+      <w:tr>
+        <w:tc>
+          <w:tcPr>
+            <w:tcW w:type="dxa" w:w="4514"/>
+          </w:tcPr>
+          <w:p>
+            <w:r>
+              <w:rPr>
+                <w:b/>
+              </w:rPr>
+              <w:t>Status</w:t>
+            </w:r>
+          </w:p>
+        </w:tc>
+        <w:tc>
+          <w:tcPr>
+            <w:tcW w:type="dxa" w:w="4514"/>
+          </w:tcPr>
+          <w:p>
+            <w:r>
+              <w:t>🟢 Aprovado</w:t>
+            </w:r>
+          </w:p>
+        </w:tc>
+      </w:tr>
+    </w:tbl>
+    <w:p/>
+    <w:p>
+      <w:r>
+        <w:rPr>
+          <w:b/>
+        </w:rPr>
+        <w:t>CT-32 — upsertResolvido — acumula tentativas no conflito</w:t>
+      </w:r>
+    </w:p>
+    <w:tbl>
+      <w:tblPr>
+        <w:tblStyle w:val="LightGrid-Accent1"/>
+        <w:tblW w:type="auto" w:w="0"/>
+        <w:tblLook w:firstColumn="1" w:firstRow="1" w:lastColumn="0" w:lastRow="0" w:noHBand="0" w:noVBand="1" w:val="04A0"/>
+      </w:tblPr>
+      <w:tblGrid>
+        <w:gridCol w:w="4514"/>
+        <w:gridCol w:w="4514"/>
+      </w:tblGrid>
+      <w:tr>
+        <w:tc>
+          <w:tcPr>
+            <w:tcW w:type="dxa" w:w="4514"/>
+          </w:tcPr>
+          <w:p>
+            <w:r>
+              <w:rPr>
+                <w:b/>
+              </w:rPr>
+              <w:t>ID</w:t>
+            </w:r>
+          </w:p>
+        </w:tc>
+        <w:tc>
+          <w:tcPr>
+            <w:tcW w:type="dxa" w:w="4514"/>
+          </w:tcPr>
+          <w:p>
+            <w:r>
+              <w:t>CT-32</w:t>
+            </w:r>
+          </w:p>
+        </w:tc>
+      </w:tr>
+      <w:tr>
+        <w:tc>
+          <w:tcPr>
+            <w:tcW w:type="dxa" w:w="4514"/>
+          </w:tcPr>
+          <w:p>
+            <w:r>
+              <w:rPr>
+                <w:b/>
+              </w:rPr>
+              <w:t>Nome</w:t>
+            </w:r>
+          </w:p>
+        </w:tc>
+        <w:tc>
+          <w:tcPr>
+            <w:tcW w:type="dxa" w:w="4514"/>
+          </w:tcPr>
+          <w:p>
+            <w:r>
+              <w:t>upsertResolvido — acumula tentativas no conflito</w:t>
+            </w:r>
+          </w:p>
+        </w:tc>
+      </w:tr>
+      <w:tr>
+        <w:tc>
+          <w:tcPr>
+            <w:tcW w:type="dxa" w:w="4514"/>
+          </w:tcPr>
+          <w:p>
+            <w:r>
+              <w:rPr>
+                <w:b/>
+              </w:rPr>
+              <w:t>Objetivo</w:t>
+            </w:r>
+          </w:p>
+        </w:tc>
+        <w:tc>
+          <w:tcPr>
+            <w:tcW w:type="dxa" w:w="4514"/>
+          </w:tcPr>
+          <w:p>
+            <w:r>
+              <w:t>Verificar que o segundo upsert do mesmo (jogador,puzzle) SOMA as tentativas em vez de sobrescrever.</w:t>
+            </w:r>
+          </w:p>
+        </w:tc>
+      </w:tr>
+      <w:tr>
+        <w:tc>
+          <w:tcPr>
+            <w:tcW w:type="dxa" w:w="4514"/>
+          </w:tcPr>
+          <w:p>
+            <w:r>
+              <w:rPr>
+                <w:b/>
+              </w:rPr>
+              <w:t>Pré-condições</w:t>
+            </w:r>
+          </w:p>
+        </w:tc>
+        <w:tc>
+          <w:tcPr>
+            <w:tcW w:type="dxa" w:w="4514"/>
+          </w:tcPr>
+          <w:p>
+            <w:r>
+              <w:t>Banco; jogador criado.</w:t>
+            </w:r>
+          </w:p>
+        </w:tc>
+      </w:tr>
+      <w:tr>
+        <w:tc>
+          <w:tcPr>
+            <w:tcW w:type="dxa" w:w="4514"/>
+          </w:tcPr>
+          <w:p>
+            <w:r>
+              <w:rPr>
+                <w:b/>
+              </w:rPr>
+              <w:t>Fluxo / Passos</w:t>
+            </w:r>
+          </w:p>
+        </w:tc>
+        <w:tc>
+          <w:tcPr>
+            <w:tcW w:type="dxa" w:w="4514"/>
+          </w:tcPr>
+          <w:p>
+            <w:r>
+              <w:t>Passos: upsertResolvido(p, t=1); upsertResolvido(p, t=3) no mesmo puzzle.</w:t>
+            </w:r>
+          </w:p>
+        </w:tc>
+      </w:tr>
+      <w:tr>
+        <w:tc>
+          <w:tcPr>
+            <w:tcW w:type="dxa" w:w="4514"/>
+          </w:tcPr>
+          <w:p>
+            <w:r>
+              <w:rPr>
+                <w:b/>
+              </w:rPr>
+              <w:t>Resultado Esperado</w:t>
+            </w:r>
+          </w:p>
+        </w:tc>
+        <w:tc>
+          <w:tcPr>
+            <w:tcW w:type="dxa" w:w="4514"/>
+          </w:tcPr>
+          <w:p>
+            <w:r>
+              <w:t>Linha final tem tentativas=4 e mantém o mesmo id da primeira inserção.</w:t>
+            </w:r>
+          </w:p>
+        </w:tc>
+      </w:tr>
+      <w:tr>
+        <w:tc>
+          <w:tcPr>
+            <w:tcW w:type="dxa" w:w="4514"/>
+          </w:tcPr>
+          <w:p>
+            <w:r>
+              <w:rPr>
+                <w:b/>
+              </w:rPr>
+              <w:t>Status</w:t>
+            </w:r>
+          </w:p>
+        </w:tc>
+        <w:tc>
+          <w:tcPr>
+            <w:tcW w:type="dxa" w:w="4514"/>
+          </w:tcPr>
+          <w:p>
+            <w:r>
+              <w:t>🟢 Aprovado</w:t>
+            </w:r>
+          </w:p>
+        </w:tc>
+      </w:tr>
+    </w:tbl>
+    <w:p/>
+    <w:p>
+      <w:r>
+        <w:rPr>
+          <w:b/>
+        </w:rPr>
+        <w:t>CT-33 — createPuzzle (admin) com lichess_id UNIQUE</w:t>
+      </w:r>
+    </w:p>
+    <w:tbl>
+      <w:tblPr>
+        <w:tblStyle w:val="LightGrid-Accent1"/>
+        <w:tblW w:type="auto" w:w="0"/>
+        <w:tblLook w:firstColumn="1" w:firstRow="1" w:lastColumn="0" w:lastRow="0" w:noHBand="0" w:noVBand="1" w:val="04A0"/>
+      </w:tblPr>
+      <w:tblGrid>
+        <w:gridCol w:w="4514"/>
+        <w:gridCol w:w="4514"/>
+      </w:tblGrid>
+      <w:tr>
+        <w:tc>
+          <w:tcPr>
+            <w:tcW w:type="dxa" w:w="4514"/>
+          </w:tcPr>
+          <w:p>
+            <w:r>
+              <w:rPr>
+                <w:b/>
+              </w:rPr>
+              <w:t>ID</w:t>
+            </w:r>
+          </w:p>
+        </w:tc>
+        <w:tc>
+          <w:tcPr>
+            <w:tcW w:type="dxa" w:w="4514"/>
+          </w:tcPr>
+          <w:p>
+            <w:r>
+              <w:t>CT-33</w:t>
+            </w:r>
+          </w:p>
+        </w:tc>
+      </w:tr>
+      <w:tr>
+        <w:tc>
+          <w:tcPr>
+            <w:tcW w:type="dxa" w:w="4514"/>
+          </w:tcPr>
+          <w:p>
+            <w:r>
+              <w:rPr>
+                <w:b/>
+              </w:rPr>
+              <w:t>Nome</w:t>
+            </w:r>
+          </w:p>
+        </w:tc>
+        <w:tc>
+          <w:tcPr>
+            <w:tcW w:type="dxa" w:w="4514"/>
+          </w:tcPr>
+          <w:p>
+            <w:r>
+              <w:t>createPuzzle (admin) com lichess_id UNIQUE</w:t>
+            </w:r>
+          </w:p>
+        </w:tc>
+      </w:tr>
+      <w:tr>
+        <w:tc>
+          <w:tcPr>
+            <w:tcW w:type="dxa" w:w="4514"/>
+          </w:tcPr>
+          <w:p>
+            <w:r>
+              <w:rPr>
+                <w:b/>
+              </w:rPr>
+              <w:t>Objetivo</w:t>
+            </w:r>
+          </w:p>
+        </w:tc>
+        <w:tc>
+          <w:tcPr>
+            <w:tcW w:type="dxa" w:w="4514"/>
+          </w:tcPr>
+          <w:p>
+            <w:r>
+              <w:t>Garantir que tentar criar dois puzzles com mesmo lichess_id falha com 23505.</w:t>
+            </w:r>
+          </w:p>
+        </w:tc>
+      </w:tr>
+      <w:tr>
+        <w:tc>
+          <w:tcPr>
+            <w:tcW w:type="dxa" w:w="4514"/>
+          </w:tcPr>
+          <w:p>
+            <w:r>
+              <w:rPr>
+                <w:b/>
+              </w:rPr>
+              <w:t>Pré-condições</w:t>
+            </w:r>
+          </w:p>
+        </w:tc>
+        <w:tc>
+          <w:tcPr>
+            <w:tcW w:type="dxa" w:w="4514"/>
+          </w:tcPr>
+          <w:p>
+            <w:r>
+              <w:t>Banco com schema; admin criado e promovido.</w:t>
+            </w:r>
+          </w:p>
+        </w:tc>
+      </w:tr>
+      <w:tr>
+        <w:tc>
+          <w:tcPr>
+            <w:tcW w:type="dxa" w:w="4514"/>
+          </w:tcPr>
+          <w:p>
+            <w:r>
+              <w:rPr>
+                <w:b/>
+              </w:rPr>
+              <w:t>Fluxo / Passos</w:t>
+            </w:r>
+          </w:p>
+        </w:tc>
+        <w:tc>
+          <w:tcPr>
+            <w:tcW w:type="dxa" w:w="4514"/>
+          </w:tcPr>
+          <w:p>
+            <w:r>
+              <w:t>Passos: createPuzzle(lichessId="dup"); createPuzzle(lichessId="dup").</w:t>
+            </w:r>
+          </w:p>
+        </w:tc>
+      </w:tr>
+      <w:tr>
+        <w:tc>
+          <w:tcPr>
+            <w:tcW w:type="dxa" w:w="4514"/>
+          </w:tcPr>
+          <w:p>
+            <w:r>
+              <w:rPr>
+                <w:b/>
+              </w:rPr>
+              <w:t>Resultado Esperado</w:t>
+            </w:r>
+          </w:p>
+        </w:tc>
+        <w:tc>
+          <w:tcPr>
+            <w:tcW w:type="dxa" w:w="4514"/>
+          </w:tcPr>
+          <w:p>
+            <w:r>
+              <w:t>Segunda chamada rejeita com {code: "23505"}.</w:t>
+            </w:r>
+          </w:p>
+        </w:tc>
+      </w:tr>
+      <w:tr>
+        <w:tc>
+          <w:tcPr>
+            <w:tcW w:type="dxa" w:w="4514"/>
+          </w:tcPr>
+          <w:p>
+            <w:r>
+              <w:rPr>
+                <w:b/>
+              </w:rPr>
+              <w:t>Status</w:t>
+            </w:r>
+          </w:p>
+        </w:tc>
+        <w:tc>
+          <w:tcPr>
+            <w:tcW w:type="dxa" w:w="4514"/>
+          </w:tcPr>
+          <w:p>
+            <w:r>
+              <w:t>🟢 Aprovado</w:t>
+            </w:r>
+          </w:p>
+        </w:tc>
+      </w:tr>
+    </w:tbl>
+    <w:p/>
+    <w:p>
+      <w:r>
+        <w:rPr>
+          <w:b/>
+        </w:rPr>
+        <w:t>CT-34 — GET /api/puzzles/daily — proxy Lichess responde</w:t>
+      </w:r>
+    </w:p>
+    <w:tbl>
+      <w:tblPr>
+        <w:tblStyle w:val="LightGrid-Accent1"/>
+        <w:tblW w:type="auto" w:w="0"/>
+        <w:tblLook w:firstColumn="1" w:firstRow="1" w:lastColumn="0" w:lastRow="0" w:noHBand="0" w:noVBand="1" w:val="04A0"/>
+      </w:tblPr>
+      <w:tblGrid>
+        <w:gridCol w:w="4514"/>
+        <w:gridCol w:w="4514"/>
+      </w:tblGrid>
+      <w:tr>
+        <w:tc>
+          <w:tcPr>
+            <w:tcW w:type="dxa" w:w="4514"/>
+          </w:tcPr>
+          <w:p>
+            <w:r>
+              <w:rPr>
+                <w:b/>
+              </w:rPr>
+              <w:t>ID</w:t>
+            </w:r>
+          </w:p>
+        </w:tc>
+        <w:tc>
+          <w:tcPr>
+            <w:tcW w:type="dxa" w:w="4514"/>
+          </w:tcPr>
+          <w:p>
+            <w:r>
+              <w:t>CT-34</w:t>
+            </w:r>
+          </w:p>
+        </w:tc>
+      </w:tr>
+      <w:tr>
+        <w:tc>
+          <w:tcPr>
+            <w:tcW w:type="dxa" w:w="4514"/>
+          </w:tcPr>
+          <w:p>
+            <w:r>
+              <w:rPr>
+                <w:b/>
+              </w:rPr>
+              <w:t>Nome</w:t>
+            </w:r>
+          </w:p>
+        </w:tc>
+        <w:tc>
+          <w:tcPr>
+            <w:tcW w:type="dxa" w:w="4514"/>
+          </w:tcPr>
+          <w:p>
+            <w:r>
+              <w:t>GET /api/puzzles/daily — proxy Lichess responde</w:t>
+            </w:r>
+          </w:p>
+        </w:tc>
+      </w:tr>
+      <w:tr>
+        <w:tc>
+          <w:tcPr>
+            <w:tcW w:type="dxa" w:w="4514"/>
+          </w:tcPr>
+          <w:p>
+            <w:r>
+              <w:rPr>
+                <w:b/>
+              </w:rPr>
+              <w:t>Objetivo</w:t>
+            </w:r>
+          </w:p>
+        </w:tc>
+        <w:tc>
+          <w:tcPr>
+            <w:tcW w:type="dxa" w:w="4514"/>
+          </w:tcPr>
+          <w:p>
+            <w:r>
+              <w:t>Smoke test do proxy server-side que repassa a chamada ao Lichess público.</w:t>
+            </w:r>
+          </w:p>
+        </w:tc>
+      </w:tr>
+      <w:tr>
+        <w:tc>
+          <w:tcPr>
+            <w:tcW w:type="dxa" w:w="4514"/>
+          </w:tcPr>
+          <w:p>
+            <w:r>
+              <w:rPr>
+                <w:b/>
+              </w:rPr>
+              <w:t>Pré-condições</w:t>
+            </w:r>
+          </w:p>
+        </w:tc>
+        <w:tc>
+          <w:tcPr>
+            <w:tcW w:type="dxa" w:w="4514"/>
+          </w:tcPr>
+          <w:p>
+            <w:r>
+              <w:t>Conectividade externa (fallback gracioso para rate-limit).</w:t>
+            </w:r>
+          </w:p>
+        </w:tc>
+      </w:tr>
+      <w:tr>
+        <w:tc>
+          <w:tcPr>
+            <w:tcW w:type="dxa" w:w="4514"/>
+          </w:tcPr>
+          <w:p>
+            <w:r>
+              <w:rPr>
+                <w:b/>
+              </w:rPr>
+              <w:t>Fluxo / Passos</w:t>
+            </w:r>
+          </w:p>
+        </w:tc>
+        <w:tc>
+          <w:tcPr>
+            <w:tcW w:type="dxa" w:w="4514"/>
+          </w:tcPr>
+          <w:p>
+            <w:r>
+              <w:t>Passos: chamar fetchPuzzleById("daily").</w:t>
+            </w:r>
+          </w:p>
+        </w:tc>
+      </w:tr>
+      <w:tr>
+        <w:tc>
+          <w:tcPr>
+            <w:tcW w:type="dxa" w:w="4514"/>
+          </w:tcPr>
+          <w:p>
+            <w:r>
+              <w:rPr>
+                <w:b/>
+              </w:rPr>
+              <w:t>Resultado Esperado</w:t>
+            </w:r>
+          </w:p>
+        </w:tc>
+        <w:tc>
+          <w:tcPr>
+            <w:tcW w:type="dxa" w:w="4514"/>
+          </w:tcPr>
+          <w:p>
+            <w:r>
+              <w:t>Resposta com campos "puzzle" e "game". Em caso de 429 do Lichess, teste passa em modo graceful.</w:t>
+            </w:r>
+          </w:p>
+        </w:tc>
+      </w:tr>
+      <w:tr>
+        <w:tc>
+          <w:tcPr>
+            <w:tcW w:type="dxa" w:w="4514"/>
+          </w:tcPr>
+          <w:p>
+            <w:r>
+              <w:rPr>
+                <w:b/>
+              </w:rPr>
+              <w:t>Status</w:t>
+            </w:r>
+          </w:p>
+        </w:tc>
+        <w:tc>
+          <w:tcPr>
+            <w:tcW w:type="dxa" w:w="4514"/>
+          </w:tcPr>
+          <w:p>
+            <w:r>
+              <w:t>🟢 Aprovado</w:t>
+            </w:r>
+          </w:p>
+        </w:tc>
+      </w:tr>
+    </w:tbl>
+    <w:p/>
+    <w:p>
+      <w:r>
+        <w:rPr>
+          <w:b/>
+        </w:rPr>
+        <w:t>CT-35 — E2E Auth — register → logout → login</w:t>
+      </w:r>
+    </w:p>
+    <w:tbl>
+      <w:tblPr>
+        <w:tblStyle w:val="LightGrid-Accent1"/>
+        <w:tblW w:type="auto" w:w="0"/>
+        <w:tblLook w:firstColumn="1" w:firstRow="1" w:lastColumn="0" w:lastRow="0" w:noHBand="0" w:noVBand="1" w:val="04A0"/>
+      </w:tblPr>
+      <w:tblGrid>
+        <w:gridCol w:w="4514"/>
+        <w:gridCol w:w="4514"/>
+      </w:tblGrid>
+      <w:tr>
+        <w:tc>
+          <w:tcPr>
+            <w:tcW w:type="dxa" w:w="4514"/>
+          </w:tcPr>
+          <w:p>
+            <w:r>
+              <w:rPr>
+                <w:b/>
+              </w:rPr>
+              <w:t>ID</w:t>
+            </w:r>
+          </w:p>
+        </w:tc>
+        <w:tc>
+          <w:tcPr>
+            <w:tcW w:type="dxa" w:w="4514"/>
+          </w:tcPr>
+          <w:p>
+            <w:r>
+              <w:t>CT-35</w:t>
+            </w:r>
+          </w:p>
+        </w:tc>
+      </w:tr>
+      <w:tr>
+        <w:tc>
+          <w:tcPr>
+            <w:tcW w:type="dxa" w:w="4514"/>
+          </w:tcPr>
+          <w:p>
+            <w:r>
+              <w:rPr>
+                <w:b/>
+              </w:rPr>
+              <w:t>Nome</w:t>
+            </w:r>
+          </w:p>
+        </w:tc>
+        <w:tc>
+          <w:tcPr>
+            <w:tcW w:type="dxa" w:w="4514"/>
+          </w:tcPr>
+          <w:p>
+            <w:r>
+              <w:t>E2E Auth — register → logout → login</w:t>
+            </w:r>
+          </w:p>
+        </w:tc>
+      </w:tr>
+      <w:tr>
+        <w:tc>
+          <w:tcPr>
+            <w:tcW w:type="dxa" w:w="4514"/>
+          </w:tcPr>
+          <w:p>
+            <w:r>
+              <w:rPr>
+                <w:b/>
+              </w:rPr>
+              <w:t>Objetivo</w:t>
+            </w:r>
+          </w:p>
+        </w:tc>
+        <w:tc>
+          <w:tcPr>
+            <w:tcW w:type="dxa" w:w="4514"/>
+          </w:tcPr>
+          <w:p>
+            <w:r>
+              <w:t>Exercitar o fluxo completo de UC-01, UC-02 e UC-03 via UI no browser.</w:t>
+            </w:r>
+          </w:p>
+        </w:tc>
+      </w:tr>
+      <w:tr>
+        <w:tc>
+          <w:tcPr>
+            <w:tcW w:type="dxa" w:w="4514"/>
+          </w:tcPr>
+          <w:p>
+            <w:r>
+              <w:rPr>
+                <w:b/>
+              </w:rPr>
+              <w:t>Pré-condições</w:t>
+            </w:r>
+          </w:p>
+        </w:tc>
+        <w:tc>
+          <w:tcPr>
+            <w:tcW w:type="dxa" w:w="4514"/>
+          </w:tcPr>
+          <w:p>
+            <w:r>
+              <w:t>BancoVersao2034_test limpo; dev server na porta 3001; chromium instalado.</w:t>
+            </w:r>
+          </w:p>
+        </w:tc>
+      </w:tr>
+      <w:tr>
+        <w:tc>
+          <w:tcPr>
+            <w:tcW w:type="dxa" w:w="4514"/>
+          </w:tcPr>
+          <w:p>
+            <w:r>
+              <w:rPr>
+                <w:b/>
+              </w:rPr>
+              <w:t>Fluxo / Passos</w:t>
+            </w:r>
+          </w:p>
+        </w:tc>
+        <w:tc>
+          <w:tcPr>
+            <w:tcW w:type="dxa" w:w="4514"/>
+          </w:tcPr>
+          <w:p>
+            <w:r>
+              <w:t>Passos: abrir /routes/register; preencher; submit; logout; relogar; ver perfil.</w:t>
+            </w:r>
+          </w:p>
+        </w:tc>
+      </w:tr>
+      <w:tr>
+        <w:tc>
+          <w:tcPr>
+            <w:tcW w:type="dxa" w:w="4514"/>
+          </w:tcPr>
+          <w:p>
+            <w:r>
+              <w:rPr>
+                <w:b/>
+              </w:rPr>
+              <w:t>Resultado Esperado</w:t>
+            </w:r>
+          </w:p>
+        </w:tc>
+        <w:tc>
+          <w:tcPr>
+            <w:tcW w:type="dxa" w:w="4514"/>
+          </w:tcPr>
+          <w:p>
+            <w:r>
+              <w:t>Username aparece em /routes/profile após o re-login. Cookie httpOnly persistente.</w:t>
+            </w:r>
+          </w:p>
+        </w:tc>
+      </w:tr>
+      <w:tr>
+        <w:tc>
+          <w:tcPr>
+            <w:tcW w:type="dxa" w:w="4514"/>
+          </w:tcPr>
+          <w:p>
+            <w:r>
+              <w:rPr>
+                <w:b/>
+              </w:rPr>
+              <w:t>Status</w:t>
+            </w:r>
+          </w:p>
+        </w:tc>
+        <w:tc>
+          <w:tcPr>
+            <w:tcW w:type="dxa" w:w="4514"/>
+          </w:tcPr>
+          <w:p>
+            <w:r>
+              <w:t>🟢 Aprovado</w:t>
+            </w:r>
+          </w:p>
+        </w:tc>
+      </w:tr>
+    </w:tbl>
+    <w:p/>
+    <w:p>
+      <w:r>
+        <w:rPr>
+          <w:b/>
+        </w:rPr>
+        <w:t>CT-36 — E2E Auth — login com senha errada exibe erro</w:t>
+      </w:r>
+    </w:p>
+    <w:tbl>
+      <w:tblPr>
+        <w:tblStyle w:val="LightGrid-Accent1"/>
+        <w:tblW w:type="auto" w:w="0"/>
+        <w:tblLook w:firstColumn="1" w:firstRow="1" w:lastColumn="0" w:lastRow="0" w:noHBand="0" w:noVBand="1" w:val="04A0"/>
+      </w:tblPr>
+      <w:tblGrid>
+        <w:gridCol w:w="4514"/>
+        <w:gridCol w:w="4514"/>
+      </w:tblGrid>
+      <w:tr>
+        <w:tc>
+          <w:tcPr>
+            <w:tcW w:type="dxa" w:w="4514"/>
+          </w:tcPr>
+          <w:p>
+            <w:r>
+              <w:rPr>
+                <w:b/>
+              </w:rPr>
+              <w:t>ID</w:t>
+            </w:r>
+          </w:p>
+        </w:tc>
+        <w:tc>
+          <w:tcPr>
+            <w:tcW w:type="dxa" w:w="4514"/>
+          </w:tcPr>
+          <w:p>
+            <w:r>
+              <w:t>CT-36</w:t>
+            </w:r>
+          </w:p>
+        </w:tc>
+      </w:tr>
+      <w:tr>
+        <w:tc>
+          <w:tcPr>
+            <w:tcW w:type="dxa" w:w="4514"/>
+          </w:tcPr>
+          <w:p>
+            <w:r>
+              <w:rPr>
+                <w:b/>
+              </w:rPr>
+              <w:t>Nome</w:t>
+            </w:r>
+          </w:p>
+        </w:tc>
+        <w:tc>
+          <w:tcPr>
+            <w:tcW w:type="dxa" w:w="4514"/>
+          </w:tcPr>
+          <w:p>
+            <w:r>
+              <w:t>E2E Auth — login com senha errada exibe erro</w:t>
+            </w:r>
+          </w:p>
+        </w:tc>
+      </w:tr>
+      <w:tr>
+        <w:tc>
+          <w:tcPr>
+            <w:tcW w:type="dxa" w:w="4514"/>
+          </w:tcPr>
+          <w:p>
+            <w:r>
+              <w:rPr>
+                <w:b/>
+              </w:rPr>
+              <w:t>Objetivo</w:t>
+            </w:r>
+          </w:p>
+        </w:tc>
+        <w:tc>
+          <w:tcPr>
+            <w:tcW w:type="dxa" w:w="4514"/>
+          </w:tcPr>
+          <w:p>
+            <w:r>
+              <w:t>Garantir que a UI mostra mensagem de erro para credenciais inválidas (UC-02 fluxo alternativo).</w:t>
+            </w:r>
+          </w:p>
+        </w:tc>
+      </w:tr>
+      <w:tr>
+        <w:tc>
+          <w:tcPr>
+            <w:tcW w:type="dxa" w:w="4514"/>
+          </w:tcPr>
+          <w:p>
+            <w:r>
+              <w:rPr>
+                <w:b/>
+              </w:rPr>
+              <w:t>Pré-condições</w:t>
+            </w:r>
+          </w:p>
+        </w:tc>
+        <w:tc>
+          <w:tcPr>
+            <w:tcW w:type="dxa" w:w="4514"/>
+          </w:tcPr>
+          <w:p>
+            <w:r>
+              <w:t>Banco limpo; dev server.</w:t>
+            </w:r>
+          </w:p>
+        </w:tc>
+      </w:tr>
+      <w:tr>
+        <w:tc>
+          <w:tcPr>
+            <w:tcW w:type="dxa" w:w="4514"/>
+          </w:tcPr>
+          <w:p>
+            <w:r>
+              <w:rPr>
+                <w:b/>
+              </w:rPr>
+              <w:t>Fluxo / Passos</w:t>
+            </w:r>
+          </w:p>
+        </w:tc>
+        <w:tc>
+          <w:tcPr>
+            <w:tcW w:type="dxa" w:w="4514"/>
+          </w:tcPr>
+          <w:p>
+            <w:r>
+              <w:t>Passos: abrir /routes/login; e-mail inexistente; senha qualquer; submit.</w:t>
+            </w:r>
+          </w:p>
+        </w:tc>
+      </w:tr>
+      <w:tr>
+        <w:tc>
+          <w:tcPr>
+            <w:tcW w:type="dxa" w:w="4514"/>
+          </w:tcPr>
+          <w:p>
+            <w:r>
+              <w:rPr>
+                <w:b/>
+              </w:rPr>
+              <w:t>Resultado Esperado</w:t>
+            </w:r>
+          </w:p>
+        </w:tc>
+        <w:tc>
+          <w:tcPr>
+            <w:tcW w:type="dxa" w:w="4514"/>
+          </w:tcPr>
+          <w:p>
+            <w:r>
+              <w:t>Mensagem com palavras "inválid|erro|incorreto" aparece na página.</w:t>
+            </w:r>
+          </w:p>
+        </w:tc>
+      </w:tr>
+      <w:tr>
+        <w:tc>
+          <w:tcPr>
+            <w:tcW w:type="dxa" w:w="4514"/>
+          </w:tcPr>
+          <w:p>
+            <w:r>
+              <w:rPr>
+                <w:b/>
+              </w:rPr>
+              <w:t>Status</w:t>
+            </w:r>
+          </w:p>
+        </w:tc>
+        <w:tc>
+          <w:tcPr>
+            <w:tcW w:type="dxa" w:w="4514"/>
+          </w:tcPr>
+          <w:p>
+            <w:r>
+              <w:t>🟢 Aprovado</w:t>
+            </w:r>
+          </w:p>
+        </w:tc>
+      </w:tr>
+    </w:tbl>
+    <w:p/>
+    <w:p>
+      <w:r>
+        <w:rPr>
+          <w:b/>
+        </w:rPr>
+        <w:t>CT-37 — E2E Profile CRUD — ler, editar nome, excluir conta</w:t>
+      </w:r>
+    </w:p>
+    <w:tbl>
+      <w:tblPr>
+        <w:tblStyle w:val="LightGrid-Accent1"/>
+        <w:tblW w:type="auto" w:w="0"/>
+        <w:tblLook w:firstColumn="1" w:firstRow="1" w:lastColumn="0" w:lastRow="0" w:noHBand="0" w:noVBand="1" w:val="04A0"/>
+      </w:tblPr>
+      <w:tblGrid>
+        <w:gridCol w:w="4514"/>
+        <w:gridCol w:w="4514"/>
+      </w:tblGrid>
+      <w:tr>
+        <w:tc>
+          <w:tcPr>
+            <w:tcW w:type="dxa" w:w="4514"/>
+          </w:tcPr>
+          <w:p>
+            <w:r>
+              <w:rPr>
+                <w:b/>
+              </w:rPr>
+              <w:t>ID</w:t>
+            </w:r>
+          </w:p>
+        </w:tc>
+        <w:tc>
+          <w:tcPr>
+            <w:tcW w:type="dxa" w:w="4514"/>
+          </w:tcPr>
+          <w:p>
+            <w:r>
+              <w:t>CT-37</w:t>
+            </w:r>
+          </w:p>
+        </w:tc>
+      </w:tr>
+      <w:tr>
+        <w:tc>
+          <w:tcPr>
+            <w:tcW w:type="dxa" w:w="4514"/>
+          </w:tcPr>
+          <w:p>
+            <w:r>
+              <w:rPr>
+                <w:b/>
+              </w:rPr>
+              <w:t>Nome</w:t>
+            </w:r>
+          </w:p>
+        </w:tc>
+        <w:tc>
+          <w:tcPr>
+            <w:tcW w:type="dxa" w:w="4514"/>
+          </w:tcPr>
+          <w:p>
+            <w:r>
+              <w:t>E2E Profile CRUD — ler, editar nome, excluir conta</w:t>
+            </w:r>
+          </w:p>
+        </w:tc>
+      </w:tr>
+      <w:tr>
+        <w:tc>
+          <w:tcPr>
+            <w:tcW w:type="dxa" w:w="4514"/>
+          </w:tcPr>
+          <w:p>
+            <w:r>
+              <w:rPr>
+                <w:b/>
+              </w:rPr>
+              <w:t>Objetivo</w:t>
+            </w:r>
+          </w:p>
+        </w:tc>
+        <w:tc>
+          <w:tcPr>
+            <w:tcW w:type="dxa" w:w="4514"/>
+          </w:tcPr>
+          <w:p>
+            <w:r>
+              <w:t>Cobrir UC-05, UC-06 e UC-07 ponta a ponta pela /routes/profile.</w:t>
+            </w:r>
+          </w:p>
+        </w:tc>
+      </w:tr>
+      <w:tr>
+        <w:tc>
+          <w:tcPr>
+            <w:tcW w:type="dxa" w:w="4514"/>
+          </w:tcPr>
+          <w:p>
+            <w:r>
+              <w:rPr>
+                <w:b/>
+              </w:rPr>
+              <w:t>Pré-condições</w:t>
+            </w:r>
+          </w:p>
+        </w:tc>
+        <w:tc>
+          <w:tcPr>
+            <w:tcW w:type="dxa" w:w="4514"/>
+          </w:tcPr>
+          <w:p>
+            <w:r>
+              <w:t>Banco; dev server.</w:t>
+            </w:r>
+          </w:p>
+        </w:tc>
+      </w:tr>
+      <w:tr>
+        <w:tc>
+          <w:tcPr>
+            <w:tcW w:type="dxa" w:w="4514"/>
+          </w:tcPr>
+          <w:p>
+            <w:r>
+              <w:rPr>
+                <w:b/>
+              </w:rPr>
+              <w:t>Fluxo / Passos</w:t>
+            </w:r>
+          </w:p>
+        </w:tc>
+        <w:tc>
+          <w:tcPr>
+            <w:tcW w:type="dxa" w:w="4514"/>
+          </w:tcPr>
+          <w:p>
+            <w:r>
+              <w:t>Passos: registrar; ir pro profile; ver username; editar nome para "Depois"; clicar "Excluir conta".</w:t>
+            </w:r>
+          </w:p>
+        </w:tc>
+      </w:tr>
+      <w:tr>
+        <w:tc>
+          <w:tcPr>
+            <w:tcW w:type="dxa" w:w="4514"/>
+          </w:tcPr>
+          <w:p>
+            <w:r>
+              <w:rPr>
+                <w:b/>
+              </w:rPr>
+              <w:t>Resultado Esperado</w:t>
+            </w:r>
+          </w:p>
+        </w:tc>
+        <w:tc>
+          <w:tcPr>
+            <w:tcW w:type="dxa" w:w="4514"/>
+          </w:tcPr>
+          <w:p>
+            <w:r>
+              <w:t>Após excluir, navegação para /routes/profile redireciona pro login.</w:t>
+            </w:r>
+          </w:p>
+        </w:tc>
+      </w:tr>
+      <w:tr>
+        <w:tc>
+          <w:tcPr>
+            <w:tcW w:type="dxa" w:w="4514"/>
+          </w:tcPr>
+          <w:p>
+            <w:r>
+              <w:rPr>
+                <w:b/>
+              </w:rPr>
+              <w:t>Status</w:t>
+            </w:r>
+          </w:p>
+        </w:tc>
+        <w:tc>
+          <w:tcPr>
+            <w:tcW w:type="dxa" w:w="4514"/>
+          </w:tcPr>
+          <w:p>
+            <w:r>
+              <w:t>🟢 Aprovado</w:t>
+            </w:r>
+          </w:p>
+        </w:tc>
+      </w:tr>
+    </w:tbl>
+    <w:p/>
+    <w:p>
+      <w:r>
+        <w:rPr>
+          <w:b/>
+        </w:rPr>
+        <w:t>CT-38 — E2E Histórico de Puzzles — criar e excluir resolvido</w:t>
+      </w:r>
+    </w:p>
+    <w:tbl>
+      <w:tblPr>
+        <w:tblStyle w:val="LightGrid-Accent1"/>
+        <w:tblW w:type="auto" w:w="0"/>
+        <w:tblLook w:firstColumn="1" w:firstRow="1" w:lastColumn="0" w:lastRow="0" w:noHBand="0" w:noVBand="1" w:val="04A0"/>
+      </w:tblPr>
+      <w:tblGrid>
+        <w:gridCol w:w="4514"/>
+        <w:gridCol w:w="4514"/>
+      </w:tblGrid>
+      <w:tr>
+        <w:tc>
+          <w:tcPr>
+            <w:tcW w:type="dxa" w:w="4514"/>
+          </w:tcPr>
+          <w:p>
+            <w:r>
+              <w:rPr>
+                <w:b/>
+              </w:rPr>
+              <w:t>ID</w:t>
+            </w:r>
+          </w:p>
+        </w:tc>
+        <w:tc>
+          <w:tcPr>
+            <w:tcW w:type="dxa" w:w="4514"/>
+          </w:tcPr>
+          <w:p>
+            <w:r>
+              <w:t>CT-38</w:t>
+            </w:r>
+          </w:p>
+        </w:tc>
+      </w:tr>
+      <w:tr>
+        <w:tc>
+          <w:tcPr>
+            <w:tcW w:type="dxa" w:w="4514"/>
+          </w:tcPr>
+          <w:p>
+            <w:r>
+              <w:rPr>
+                <w:b/>
+              </w:rPr>
+              <w:t>Nome</w:t>
+            </w:r>
+          </w:p>
+        </w:tc>
+        <w:tc>
+          <w:tcPr>
+            <w:tcW w:type="dxa" w:w="4514"/>
+          </w:tcPr>
+          <w:p>
+            <w:r>
+              <w:t>E2E Histórico de Puzzles — criar e excluir resolvido</w:t>
+            </w:r>
+          </w:p>
+        </w:tc>
+      </w:tr>
+      <w:tr>
+        <w:tc>
+          <w:tcPr>
+            <w:tcW w:type="dxa" w:w="4514"/>
+          </w:tcPr>
+          <w:p>
+            <w:r>
+              <w:rPr>
+                <w:b/>
+              </w:rPr>
+              <w:t>Objetivo</w:t>
+            </w:r>
+          </w:p>
+        </w:tc>
+        <w:tc>
+          <w:tcPr>
+            <w:tcW w:type="dxa" w:w="4514"/>
+          </w:tcPr>
+          <w:p>
+            <w:r>
+              <w:t>Cobrir create + delete na tela /routes/puzzles/history.</w:t>
+            </w:r>
+          </w:p>
+        </w:tc>
+      </w:tr>
+      <w:tr>
+        <w:tc>
+          <w:tcPr>
+            <w:tcW w:type="dxa" w:w="4514"/>
+          </w:tcPr>
+          <w:p>
+            <w:r>
+              <w:rPr>
+                <w:b/>
+              </w:rPr>
+              <w:t>Pré-condições</w:t>
+            </w:r>
+          </w:p>
+        </w:tc>
+        <w:tc>
+          <w:tcPr>
+            <w:tcW w:type="dxa" w:w="4514"/>
+          </w:tcPr>
+          <w:p>
+            <w:r>
+              <w:t>Banco; dev server.</w:t>
+            </w:r>
+          </w:p>
+        </w:tc>
+      </w:tr>
+      <w:tr>
+        <w:tc>
+          <w:tcPr>
+            <w:tcW w:type="dxa" w:w="4514"/>
+          </w:tcPr>
+          <w:p>
+            <w:r>
+              <w:rPr>
+                <w:b/>
+              </w:rPr>
+              <w:t>Fluxo / Passos</w:t>
+            </w:r>
+          </w:p>
+        </w:tc>
+        <w:tc>
+          <w:tcPr>
+            <w:tcW w:type="dxa" w:w="4514"/>
+          </w:tcPr>
+          <w:p>
+            <w:r>
+              <w:t>Passos: registrar; abrir history; preencher modal com puzzleId "e2e-test-001"; salvar; confirmar; excluir.</w:t>
+            </w:r>
+          </w:p>
+        </w:tc>
+      </w:tr>
+      <w:tr>
+        <w:tc>
+          <w:tcPr>
+            <w:tcW w:type="dxa" w:w="4514"/>
+          </w:tcPr>
+          <w:p>
+            <w:r>
+              <w:rPr>
+                <w:b/>
+              </w:rPr>
+              <w:t>Resultado Esperado</w:t>
+            </w:r>
+          </w:p>
+        </w:tc>
+        <w:tc>
+          <w:tcPr>
+            <w:tcW w:type="dxa" w:w="4514"/>
+          </w:tcPr>
+          <w:p>
+            <w:r>
+              <w:t>Linha aparece após salvar; sai após excluir.</w:t>
+            </w:r>
+          </w:p>
+        </w:tc>
+      </w:tr>
+      <w:tr>
+        <w:tc>
+          <w:tcPr>
+            <w:tcW w:type="dxa" w:w="4514"/>
+          </w:tcPr>
+          <w:p>
+            <w:r>
+              <w:rPr>
+                <w:b/>
+              </w:rPr>
+              <w:t>Status</w:t>
+            </w:r>
+          </w:p>
+        </w:tc>
+        <w:tc>
+          <w:tcPr>
+            <w:tcW w:type="dxa" w:w="4514"/>
+          </w:tcPr>
+          <w:p>
+            <w:r>
+              <w:t>🟢 Aprovado</w:t>
+            </w:r>
+          </w:p>
+        </w:tc>
+      </w:tr>
+    </w:tbl>
+    <w:p/>
+    <w:p>
+      <w:r>
+        <w:rPr>
+          <w:b/>
+        </w:rPr>
+        <w:t>CT-39 — E2E Admin — criar puzzle pelo painel</w:t>
+      </w:r>
+    </w:p>
+    <w:tbl>
+      <w:tblPr>
+        <w:tblStyle w:val="LightGrid-Accent1"/>
+        <w:tblW w:type="auto" w:w="0"/>
+        <w:tblLook w:firstColumn="1" w:firstRow="1" w:lastColumn="0" w:lastRow="0" w:noHBand="0" w:noVBand="1" w:val="04A0"/>
+      </w:tblPr>
+      <w:tblGrid>
+        <w:gridCol w:w="4514"/>
+        <w:gridCol w:w="4514"/>
+      </w:tblGrid>
+      <w:tr>
+        <w:tc>
+          <w:tcPr>
+            <w:tcW w:type="dxa" w:w="4514"/>
+          </w:tcPr>
+          <w:p>
+            <w:r>
+              <w:rPr>
+                <w:b/>
+              </w:rPr>
+              <w:t>ID</w:t>
+            </w:r>
+          </w:p>
+        </w:tc>
+        <w:tc>
+          <w:tcPr>
+            <w:tcW w:type="dxa" w:w="4514"/>
+          </w:tcPr>
+          <w:p>
+            <w:r>
+              <w:t>CT-39</w:t>
+            </w:r>
+          </w:p>
+        </w:tc>
+      </w:tr>
+      <w:tr>
+        <w:tc>
+          <w:tcPr>
+            <w:tcW w:type="dxa" w:w="4514"/>
+          </w:tcPr>
+          <w:p>
+            <w:r>
+              <w:rPr>
+                <w:b/>
+              </w:rPr>
+              <w:t>Nome</w:t>
+            </w:r>
+          </w:p>
+        </w:tc>
+        <w:tc>
+          <w:tcPr>
+            <w:tcW w:type="dxa" w:w="4514"/>
+          </w:tcPr>
+          <w:p>
+            <w:r>
+              <w:t>E2E Admin — criar puzzle pelo painel</w:t>
+            </w:r>
+          </w:p>
+        </w:tc>
+      </w:tr>
+      <w:tr>
+        <w:tc>
+          <w:tcPr>
+            <w:tcW w:type="dxa" w:w="4514"/>
+          </w:tcPr>
+          <w:p>
+            <w:r>
+              <w:rPr>
+                <w:b/>
+              </w:rPr>
+              <w:t>Objetivo</w:t>
+            </w:r>
+          </w:p>
+        </w:tc>
+        <w:tc>
+          <w:tcPr>
+            <w:tcW w:type="dxa" w:w="4514"/>
+          </w:tcPr>
+          <w:p>
+            <w:r>
+              <w:t>Cobrir UC-20 + UC-21 pela /routes/administracao/puzzles após promover o usuário a admin.</w:t>
+            </w:r>
+          </w:p>
+        </w:tc>
+      </w:tr>
+      <w:tr>
+        <w:tc>
+          <w:tcPr>
+            <w:tcW w:type="dxa" w:w="4514"/>
+          </w:tcPr>
+          <w:p>
+            <w:r>
+              <w:rPr>
+                <w:b/>
+              </w:rPr>
+              <w:t>Pré-condições</w:t>
+            </w:r>
+          </w:p>
+        </w:tc>
+        <w:tc>
+          <w:tcPr>
+            <w:tcW w:type="dxa" w:w="4514"/>
+          </w:tcPr>
+          <w:p>
+            <w:r>
+              <w:t>Banco; dev server; helper promoteUserToAdmin disponível.</w:t>
+            </w:r>
+          </w:p>
+        </w:tc>
+      </w:tr>
+      <w:tr>
+        <w:tc>
+          <w:tcPr>
+            <w:tcW w:type="dxa" w:w="4514"/>
+          </w:tcPr>
+          <w:p>
+            <w:r>
+              <w:rPr>
+                <w:b/>
+              </w:rPr>
+              <w:t>Fluxo / Passos</w:t>
+            </w:r>
+          </w:p>
+        </w:tc>
+        <w:tc>
+          <w:tcPr>
+            <w:tcW w:type="dxa" w:w="4514"/>
+          </w:tcPr>
+          <w:p>
+            <w:r>
+              <w:t>Passos: registrar; promover; abrir admin/puzzles; preencher FEN/solução/fase; criar.</w:t>
+            </w:r>
+          </w:p>
+        </w:tc>
+      </w:tr>
+      <w:tr>
+        <w:tc>
+          <w:tcPr>
+            <w:tcW w:type="dxa" w:w="4514"/>
+          </w:tcPr>
+          <w:p>
+            <w:r>
+              <w:rPr>
+                <w:b/>
+              </w:rPr>
+              <w:t>Resultado Esperado</w:t>
+            </w:r>
+          </w:p>
+        </w:tc>
+        <w:tc>
+          <w:tcPr>
+            <w:tcW w:type="dxa" w:w="4514"/>
+          </w:tcPr>
+          <w:p>
+            <w:r>
+              <w:t>Mensagem de sucesso aparece. Lista de puzzles cadastrados inclui a nova linha.</w:t>
+            </w:r>
+          </w:p>
+        </w:tc>
+      </w:tr>
+      <w:tr>
+        <w:tc>
+          <w:tcPr>
+            <w:tcW w:type="dxa" w:w="4514"/>
+          </w:tcPr>
+          <w:p>
+            <w:r>
+              <w:rPr>
+                <w:b/>
+              </w:rPr>
+              <w:t>Status</w:t>
+            </w:r>
+          </w:p>
+        </w:tc>
+        <w:tc>
+          <w:tcPr>
+            <w:tcW w:type="dxa" w:w="4514"/>
+          </w:tcPr>
+          <w:p>
+            <w:r>
+              <w:t>🟢 Aprovado</w:t>
+            </w:r>
+          </w:p>
+        </w:tc>
+      </w:tr>
+    </w:tbl>
+    <w:p/>
+    <w:p>
+      <w:r>
+        <w:rPr>
+          <w:b/>
+        </w:rPr>
+        <w:t>CT-40 — E2E Admin — criar bot pelo painel</w:t>
+      </w:r>
+    </w:p>
+    <w:tbl>
+      <w:tblPr>
+        <w:tblStyle w:val="LightGrid-Accent1"/>
+        <w:tblW w:type="auto" w:w="0"/>
+        <w:tblLook w:firstColumn="1" w:firstRow="1" w:lastColumn="0" w:lastRow="0" w:noHBand="0" w:noVBand="1" w:val="04A0"/>
+      </w:tblPr>
+      <w:tblGrid>
+        <w:gridCol w:w="4514"/>
+        <w:gridCol w:w="4514"/>
+      </w:tblGrid>
+      <w:tr>
+        <w:tc>
+          <w:tcPr>
+            <w:tcW w:type="dxa" w:w="4514"/>
+          </w:tcPr>
+          <w:p>
+            <w:r>
+              <w:rPr>
+                <w:b/>
+              </w:rPr>
+              <w:t>ID</w:t>
+            </w:r>
+          </w:p>
+        </w:tc>
+        <w:tc>
+          <w:tcPr>
+            <w:tcW w:type="dxa" w:w="4514"/>
+          </w:tcPr>
+          <w:p>
+            <w:r>
+              <w:t>CT-40</w:t>
+            </w:r>
+          </w:p>
+        </w:tc>
+      </w:tr>
+      <w:tr>
+        <w:tc>
+          <w:tcPr>
+            <w:tcW w:type="dxa" w:w="4514"/>
+          </w:tcPr>
+          <w:p>
+            <w:r>
+              <w:rPr>
+                <w:b/>
+              </w:rPr>
+              <w:t>Nome</w:t>
+            </w:r>
+          </w:p>
+        </w:tc>
+        <w:tc>
+          <w:tcPr>
+            <w:tcW w:type="dxa" w:w="4514"/>
+          </w:tcPr>
+          <w:p>
+            <w:r>
+              <w:t>E2E Admin — criar bot pelo painel</w:t>
+            </w:r>
+          </w:p>
+        </w:tc>
+      </w:tr>
+      <w:tr>
+        <w:tc>
+          <w:tcPr>
+            <w:tcW w:type="dxa" w:w="4514"/>
+          </w:tcPr>
+          <w:p>
+            <w:r>
+              <w:rPr>
+                <w:b/>
+              </w:rPr>
+              <w:t>Objetivo</w:t>
+            </w:r>
+          </w:p>
+        </w:tc>
+        <w:tc>
+          <w:tcPr>
+            <w:tcW w:type="dxa" w:w="4514"/>
+          </w:tcPr>
+          <w:p>
+            <w:r>
+              <w:t>Cobrir UC-24 + UC-25 pela /routes/administracao/bots.</w:t>
+            </w:r>
+          </w:p>
+        </w:tc>
+      </w:tr>
+      <w:tr>
+        <w:tc>
+          <w:tcPr>
+            <w:tcW w:type="dxa" w:w="4514"/>
+          </w:tcPr>
+          <w:p>
+            <w:r>
+              <w:rPr>
+                <w:b/>
+              </w:rPr>
+              <w:t>Pré-condições</w:t>
+            </w:r>
+          </w:p>
+        </w:tc>
+        <w:tc>
+          <w:tcPr>
+            <w:tcW w:type="dxa" w:w="4514"/>
+          </w:tcPr>
+          <w:p>
+            <w:r>
+              <w:t>Banco; dev server; admin promovido.</w:t>
+            </w:r>
+          </w:p>
+        </w:tc>
+      </w:tr>
+      <w:tr>
+        <w:tc>
+          <w:tcPr>
+            <w:tcW w:type="dxa" w:w="4514"/>
+          </w:tcPr>
+          <w:p>
+            <w:r>
+              <w:rPr>
+                <w:b/>
+              </w:rPr>
+              <w:t>Fluxo / Passos</w:t>
+            </w:r>
+          </w:p>
+        </w:tc>
+        <w:tc>
+          <w:tcPr>
+            <w:tcW w:type="dxa" w:w="4514"/>
+          </w:tcPr>
+          <w:p>
+            <w:r>
+              <w:t>Passos: abrir admin/bots; nome, nível e descrição; clicar Criar bot.</w:t>
+            </w:r>
+          </w:p>
+        </w:tc>
+      </w:tr>
+      <w:tr>
+        <w:tc>
+          <w:tcPr>
+            <w:tcW w:type="dxa" w:w="4514"/>
+          </w:tcPr>
+          <w:p>
+            <w:r>
+              <w:rPr>
+                <w:b/>
+              </w:rPr>
+              <w:t>Resultado Esperado</w:t>
+            </w:r>
+          </w:p>
+        </w:tc>
+        <w:tc>
+          <w:tcPr>
+            <w:tcW w:type="dxa" w:w="4514"/>
+          </w:tcPr>
+          <w:p>
+            <w:r>
+              <w:t>Bot listado abaixo do formulário com o nome esperado.</w:t>
+            </w:r>
+          </w:p>
+        </w:tc>
+      </w:tr>
+      <w:tr>
+        <w:tc>
+          <w:tcPr>
+            <w:tcW w:type="dxa" w:w="4514"/>
+          </w:tcPr>
+          <w:p>
+            <w:r>
+              <w:rPr>
+                <w:b/>
+              </w:rPr>
+              <w:t>Status</w:t>
+            </w:r>
+          </w:p>
+        </w:tc>
+        <w:tc>
+          <w:tcPr>
+            <w:tcW w:type="dxa" w:w="4514"/>
+          </w:tcPr>
+          <w:p>
+            <w:r>
+              <w:t>🟢 Aprovado</w:t>
+            </w:r>
+          </w:p>
+        </w:tc>
+      </w:tr>
+    </w:tbl>
+    <w:p/>
+    <w:p>
+      <w:r>
+        <w:rPr>
+          <w:b/>
+        </w:rPr>
+        <w:t>CT-41 — E2E Comentários — publicar, editar e excluir</w:t>
+      </w:r>
+    </w:p>
+    <w:tbl>
+      <w:tblPr>
+        <w:tblStyle w:val="LightGrid-Accent1"/>
+        <w:tblW w:type="auto" w:w="0"/>
+        <w:tblLook w:firstColumn="1" w:firstRow="1" w:lastColumn="0" w:lastRow="0" w:noHBand="0" w:noVBand="1" w:val="04A0"/>
+      </w:tblPr>
+      <w:tblGrid>
+        <w:gridCol w:w="4514"/>
+        <w:gridCol w:w="4514"/>
+      </w:tblGrid>
+      <w:tr>
+        <w:tc>
+          <w:tcPr>
+            <w:tcW w:type="dxa" w:w="4514"/>
+          </w:tcPr>
+          <w:p>
+            <w:r>
+              <w:rPr>
+                <w:b/>
+              </w:rPr>
+              <w:t>ID</w:t>
+            </w:r>
+          </w:p>
+        </w:tc>
+        <w:tc>
+          <w:tcPr>
+            <w:tcW w:type="dxa" w:w="4514"/>
+          </w:tcPr>
+          <w:p>
+            <w:r>
+              <w:t>CT-41</w:t>
+            </w:r>
+          </w:p>
+        </w:tc>
+      </w:tr>
+      <w:tr>
+        <w:tc>
+          <w:tcPr>
+            <w:tcW w:type="dxa" w:w="4514"/>
+          </w:tcPr>
+          <w:p>
+            <w:r>
+              <w:rPr>
+                <w:b/>
+              </w:rPr>
+              <w:t>Nome</w:t>
+            </w:r>
+          </w:p>
+        </w:tc>
+        <w:tc>
+          <w:tcPr>
+            <w:tcW w:type="dxa" w:w="4514"/>
+          </w:tcPr>
+          <w:p>
+            <w:r>
+              <w:t>E2E Comentários — publicar, editar e excluir</w:t>
+            </w:r>
+          </w:p>
+        </w:tc>
+      </w:tr>
+      <w:tr>
+        <w:tc>
+          <w:tcPr>
+            <w:tcW w:type="dxa" w:w="4514"/>
+          </w:tcPr>
+          <w:p>
+            <w:r>
+              <w:rPr>
+                <w:b/>
+              </w:rPr>
+              <w:t>Objetivo</w:t>
+            </w:r>
+          </w:p>
+        </w:tc>
+        <w:tc>
+          <w:tcPr>
+            <w:tcW w:type="dxa" w:w="4514"/>
+          </w:tcPr>
+          <w:p>
+            <w:r>
+              <w:t>Cobrir UC-16, UC-17, UC-18 e UC-19 pela seção de comentários da página de puzzle.</w:t>
+            </w:r>
+          </w:p>
+        </w:tc>
+      </w:tr>
+      <w:tr>
+        <w:tc>
+          <w:tcPr>
+            <w:tcW w:type="dxa" w:w="4514"/>
+          </w:tcPr>
+          <w:p>
+            <w:r>
+              <w:rPr>
+                <w:b/>
+              </w:rPr>
+              <w:t>Pré-condições</w:t>
+            </w:r>
+          </w:p>
+        </w:tc>
+        <w:tc>
+          <w:tcPr>
+            <w:tcW w:type="dxa" w:w="4514"/>
+          </w:tcPr>
+          <w:p>
+            <w:r>
+              <w:t>Banco; dev server; rota /routes/puzzles/1 com dados estáticos.</w:t>
+            </w:r>
+          </w:p>
+        </w:tc>
+      </w:tr>
+      <w:tr>
+        <w:tc>
+          <w:tcPr>
+            <w:tcW w:type="dxa" w:w="4514"/>
+          </w:tcPr>
+          <w:p>
+            <w:r>
+              <w:rPr>
+                <w:b/>
+              </w:rPr>
+              <w:t>Fluxo / Passos</w:t>
+            </w:r>
+          </w:p>
+        </w:tc>
+        <w:tc>
+          <w:tcPr>
+            <w:tcW w:type="dxa" w:w="4514"/>
+          </w:tcPr>
+          <w:p>
+            <w:r>
+              <w:t>Passos: registrar; abrir /routes/puzzles/1; publicar comentário; editá-lo; excluí-lo.</w:t>
+            </w:r>
+          </w:p>
+        </w:tc>
+      </w:tr>
+      <w:tr>
+        <w:tc>
+          <w:tcPr>
+            <w:tcW w:type="dxa" w:w="4514"/>
+          </w:tcPr>
+          <w:p>
+            <w:r>
+              <w:rPr>
+                <w:b/>
+              </w:rPr>
+              <w:t>Resultado Esperado</w:t>
+            </w:r>
+          </w:p>
+        </w:tc>
+        <w:tc>
+          <w:tcPr>
+            <w:tcW w:type="dxa" w:w="4514"/>
+          </w:tcPr>
+          <w:p>
+            <w:r>
+              <w:t>Texto original aparece; depois texto editado + marcação "editado"; após excluir, sumiu da página.</w:t>
+            </w:r>
+          </w:p>
+        </w:tc>
+      </w:tr>
+      <w:tr>
+        <w:tc>
+          <w:tcPr>
+            <w:tcW w:type="dxa" w:w="4514"/>
+          </w:tcPr>
+          <w:p>
+            <w:r>
+              <w:rPr>
+                <w:b/>
+              </w:rPr>
+              <w:t>Status</w:t>
+            </w:r>
+          </w:p>
+        </w:tc>
+        <w:tc>
+          <w:tcPr>
+            <w:tcW w:type="dxa" w:w="4514"/>
+          </w:tcPr>
+          <w:p>
+            <w:r>
+              <w:t>🟢 Aprovado</w:t>
+            </w:r>
+          </w:p>
+        </w:tc>
+      </w:tr>
+    </w:tbl>
+    <w:p/>
+    <w:p/>
+    <w:p>
+      <w:pPr>
+        <w:pStyle w:val="Heading2"/>
+      </w:pPr>
+      <w:r>
+        <w:t>4. Resumo da Suíte</w:t>
+      </w:r>
+    </w:p>
+    <w:p>
+      <w:r>
+        <w:t>A suíte completa contempla 41 casos de teste distribuídos em três níveis:</w:t>
+      </w:r>
+    </w:p>
+    <w:tbl>
+      <w:tblPr>
+        <w:tblStyle w:val="LightGrid-Accent1"/>
+        <w:tblW w:type="auto" w:w="0"/>
+        <w:tblLook w:firstColumn="1" w:firstRow="1" w:lastColumn="0" w:lastRow="0" w:noHBand="0" w:noVBand="1" w:val="04A0"/>
+      </w:tblPr>
+      <w:tblGrid>
+        <w:gridCol w:w="3010"/>
+        <w:gridCol w:w="3010"/>
+        <w:gridCol w:w="3010"/>
+      </w:tblGrid>
+      <w:tr>
+        <w:tc>
+          <w:tcPr>
+            <w:tcW w:type="dxa" w:w="3010"/>
+          </w:tcPr>
+          <w:p>
+            <w:r>
+              <w:rPr>
+                <w:b/>
+              </w:rPr>
+              <w:t>Nível</w:t>
+            </w:r>
+          </w:p>
+        </w:tc>
+        <w:tc>
+          <w:tcPr>
+            <w:tcW w:type="dxa" w:w="3010"/>
+          </w:tcPr>
+          <w:p>
+            <w:r>
+              <w:rPr>
+                <w:b/>
+              </w:rPr>
+              <w:t>IDs</w:t>
+            </w:r>
+          </w:p>
+        </w:tc>
+        <w:tc>
+          <w:tcPr>
+            <w:tcW w:type="dxa" w:w="3010"/>
+          </w:tcPr>
+          <w:p>
+            <w:r>
+              <w:rPr>
+                <w:b/>
+              </w:rPr>
+              <w:t>Total</w:t>
+            </w:r>
+          </w:p>
+        </w:tc>
+      </w:tr>
+      <w:tr>
+        <w:tc>
+          <w:tcPr>
+            <w:tcW w:type="dxa" w:w="3010"/>
+          </w:tcPr>
+          <w:p>
+            <w:r>
+              <w:t>Unitários — Sprint 2</w:t>
+            </w:r>
+          </w:p>
+        </w:tc>
+        <w:tc>
+          <w:tcPr>
+            <w:tcW w:type="dxa" w:w="3010"/>
+          </w:tcPr>
+          <w:p>
+            <w:r>
+              <w:t>CT-01 a CT-16</w:t>
+            </w:r>
+          </w:p>
+        </w:tc>
+        <w:tc>
+          <w:tcPr>
+            <w:tcW w:type="dxa" w:w="3010"/>
+          </w:tcPr>
+          <w:p>
+            <w:r>
+              <w:t>16</w:t>
+            </w:r>
+          </w:p>
+        </w:tc>
+      </w:tr>
+      <w:tr>
+        <w:tc>
+          <w:tcPr>
+            <w:tcW w:type="dxa" w:w="3010"/>
+          </w:tcPr>
+          <w:p>
+            <w:r>
+              <w:t>Unitários — Sprint 3 (novos)</w:t>
+            </w:r>
+          </w:p>
+        </w:tc>
+        <w:tc>
+          <w:tcPr>
+            <w:tcW w:type="dxa" w:w="3010"/>
+          </w:tcPr>
+          <w:p>
+            <w:r>
+              <w:t>CT-18 a CT-26</w:t>
+            </w:r>
+          </w:p>
+        </w:tc>
+        <w:tc>
+          <w:tcPr>
+            <w:tcW w:type="dxa" w:w="3010"/>
+          </w:tcPr>
+          <w:p>
+            <w:r>
+              <w:t>9</w:t>
+            </w:r>
+          </w:p>
+        </w:tc>
+      </w:tr>
+      <w:tr>
+        <w:tc>
+          <w:tcPr>
+            <w:tcW w:type="dxa" w:w="3010"/>
+          </w:tcPr>
+          <w:p>
+            <w:r>
+              <w:t>Integração</w:t>
+            </w:r>
+          </w:p>
+        </w:tc>
+        <w:tc>
+          <w:tcPr>
+            <w:tcW w:type="dxa" w:w="3010"/>
+          </w:tcPr>
+          <w:p>
+            <w:r>
+              <w:t>CT-17, CT-27 a CT-34</w:t>
+            </w:r>
+          </w:p>
+        </w:tc>
+        <w:tc>
+          <w:tcPr>
+            <w:tcW w:type="dxa" w:w="3010"/>
+          </w:tcPr>
+          <w:p>
+            <w:r>
+              <w:t>9</w:t>
+            </w:r>
+          </w:p>
+        </w:tc>
+      </w:tr>
+      <w:tr>
+        <w:tc>
+          <w:tcPr>
+            <w:tcW w:type="dxa" w:w="3010"/>
+          </w:tcPr>
+          <w:p>
+            <w:r>
+              <w:t>E2E (Playwright)</w:t>
+            </w:r>
+          </w:p>
+        </w:tc>
+        <w:tc>
+          <w:tcPr>
+            <w:tcW w:type="dxa" w:w="3010"/>
+          </w:tcPr>
+          <w:p>
+            <w:r>
+              <w:t>CT-35 a CT-41</w:t>
+            </w:r>
+          </w:p>
+        </w:tc>
+        <w:tc>
+          <w:tcPr>
+            <w:tcW w:type="dxa" w:w="3010"/>
+          </w:tcPr>
+          <w:p>
+            <w:r>
+              <w:t>7</w:t>
+            </w:r>
+          </w:p>
+        </w:tc>
+      </w:tr>
+    </w:tbl>
+    <w:p/>
+    <w:p>
+      <w:r>
+        <w:t>Total: 41 casos. Ferramentas usadas: Vitest 4 (unitários + integração), Playwright 1.49 (E2E), @vitest/coverage-v8 (cobertura ≥70% em src/lib).</w:t>
+      </w:r>
     </w:p>
     <w:sectPr>
       <w:pgSz w:w="11909" w:h="16834"/>

</xml_diff>

<commit_message>
Fé em cristo que vai dar certo -icaro e ryan
</commit_message>
<xml_diff>
--- a/Docs/CesuChess_Casos_de_Teste.docx
+++ b/Docs/CesuChess_Casos_de_Teste.docx
@@ -11490,6 +11490,818 @@
     <w:p/>
     <w:p/>
     <w:p>
+      <w:r>
+        <w:rPr>
+          <w:b/>
+        </w:rPr>
+        <w:t xml:space="preserve">CT-42 — validatePuzzleNome — limites do nome do puzzle</w:t>
+      </w:r>
+    </w:p>
+    <w:tbl>
+      <w:tblPr>
+        <w:tblStyle w:val="LightGrid-Accent1"/>
+        <w:tblW w:type="auto" w:w="0"/>
+        <w:tblLook w:firstColumn="1" w:firstRow="1" w:lastColumn="0" w:lastRow="0" w:noHBand="0" w:noVBand="1" w:val="04A0"/>
+      </w:tblPr>
+      <w:tblGrid>
+        <w:gridCol w:w="4514"/>
+        <w:gridCol w:w="4514"/>
+      </w:tblGrid>
+      <w:tr>
+        <w:tc>
+          <w:tcPr>
+            <w:tcW w:type="dxa" w:w="4514"/>
+          </w:tcPr>
+          <w:p>
+            <w:r>
+              <w:rPr>
+                <w:b/>
+              </w:rPr>
+              <w:t>ID</w:t>
+            </w:r>
+          </w:p>
+        </w:tc>
+        <w:tc>
+          <w:tcPr>
+            <w:tcW w:type="dxa" w:w="4514"/>
+          </w:tcPr>
+          <w:p>
+            <w:r>
+              <w:t>CT-42</w:t>
+            </w:r>
+          </w:p>
+        </w:tc>
+      </w:tr>
+      <w:tr>
+        <w:tc>
+          <w:tcPr>
+            <w:tcW w:type="dxa" w:w="4514"/>
+          </w:tcPr>
+          <w:p>
+            <w:r>
+              <w:rPr>
+                <w:b/>
+              </w:rPr>
+              <w:t>Nome</w:t>
+            </w:r>
+          </w:p>
+        </w:tc>
+        <w:tc>
+          <w:tcPr>
+            <w:tcW w:type="dxa" w:w="4514"/>
+          </w:tcPr>
+          <w:p>
+            <w:r>
+              <w:t>validatePuzzleNome — limites do nome do puzzle</w:t>
+            </w:r>
+          </w:p>
+        </w:tc>
+      </w:tr>
+      <w:tr>
+        <w:tc>
+          <w:tcPr>
+            <w:tcW w:type="dxa" w:w="4514"/>
+          </w:tcPr>
+          <w:p>
+            <w:r>
+              <w:rPr>
+                <w:b/>
+              </w:rPr>
+              <w:t>Objetivo</w:t>
+            </w:r>
+          </w:p>
+        </w:tc>
+        <w:tc>
+          <w:tcPr>
+            <w:tcW w:type="dxa" w:w="4514"/>
+          </w:tcPr>
+          <w:p>
+            <w:r>
+              <w:t>Garantir que o validador do nome do puzzle aceita texto válido e rejeita curto, longo ou não-string.</w:t>
+            </w:r>
+          </w:p>
+        </w:tc>
+      </w:tr>
+      <w:tr>
+        <w:tc>
+          <w:tcPr>
+            <w:tcW w:type="dxa" w:w="4514"/>
+          </w:tcPr>
+          <w:p>
+            <w:r>
+              <w:rPr>
+                <w:b/>
+              </w:rPr>
+              <w:t>Pré-condições</w:t>
+            </w:r>
+          </w:p>
+        </w:tc>
+        <w:tc>
+          <w:tcPr>
+            <w:tcW w:type="dxa" w:w="4514"/>
+          </w:tcPr>
+          <w:p>
+            <w:r>
+              <w:t>Validador validatePuzzleNome acessível (src/lib/validation).</w:t>
+            </w:r>
+          </w:p>
+        </w:tc>
+      </w:tr>
+      <w:tr>
+        <w:tc>
+          <w:tcPr>
+            <w:tcW w:type="dxa" w:w="4514"/>
+          </w:tcPr>
+          <w:p>
+            <w:r>
+              <w:rPr>
+                <w:b/>
+              </w:rPr>
+              <w:t>Fluxo / Passos</w:t>
+            </w:r>
+          </w:p>
+        </w:tc>
+        <w:tc>
+          <w:tcPr>
+            <w:tcW w:type="dxa" w:w="4514"/>
+          </w:tcPr>
+          <w:p>
+            <w:r>
+              <w:t>Casos: "Mate em 2 — sacrifício de dama" → null;</w:t>
+            </w:r>
+            <w:r>
+              <w:br/>
+            </w:r>
+            <w:r>
+              <w:t>"A" (1 char) → erro mínimo; "A"×121 → erro máximo;</w:t>
+            </w:r>
+            <w:r>
+              <w:br/>
+            </w:r>
+            <w:r>
+              <w:t>undefined → "Nome do puzzle inválido.".</w:t>
+            </w:r>
+          </w:p>
+        </w:tc>
+      </w:tr>
+      <w:tr>
+        <w:tc>
+          <w:tcPr>
+            <w:tcW w:type="dxa" w:w="4514"/>
+          </w:tcPr>
+          <w:p>
+            <w:r>
+              <w:rPr>
+                <w:b/>
+              </w:rPr>
+              <w:t>Resultado Esperado</w:t>
+            </w:r>
+          </w:p>
+        </w:tc>
+        <w:tc>
+          <w:tcPr>
+            <w:tcW w:type="dxa" w:w="4514"/>
+          </w:tcPr>
+          <w:p>
+            <w:r>
+              <w:t>null para o válido; mensagens de erro corretas para os inválidos.</w:t>
+            </w:r>
+          </w:p>
+        </w:tc>
+      </w:tr>
+      <w:tr>
+        <w:tc>
+          <w:tcPr>
+            <w:tcW w:type="dxa" w:w="4514"/>
+          </w:tcPr>
+          <w:p>
+            <w:r>
+              <w:rPr>
+                <w:b/>
+              </w:rPr>
+              <w:t>Status</w:t>
+            </w:r>
+          </w:p>
+        </w:tc>
+        <w:tc>
+          <w:tcPr>
+            <w:tcW w:type="dxa" w:w="4514"/>
+          </w:tcPr>
+          <w:p>
+            <w:r>
+              <w:t>🟢 Aprovado</w:t>
+            </w:r>
+          </w:p>
+        </w:tc>
+      </w:tr>
+    </w:tbl>
+    <w:p>
+      <w:r>
+        <w:rPr>
+          <w:b/>
+        </w:rPr>
+        <w:t xml:space="preserve">CT-43 — converterPuzzleLichess — PGN do Lichess para FEN jogável</w:t>
+      </w:r>
+    </w:p>
+    <w:tbl>
+      <w:tblPr>
+        <w:tblStyle w:val="LightGrid-Accent1"/>
+        <w:tblW w:type="auto" w:w="0"/>
+        <w:tblLook w:firstColumn="1" w:firstRow="1" w:lastColumn="0" w:lastRow="0" w:noHBand="0" w:noVBand="1" w:val="04A0"/>
+      </w:tblPr>
+      <w:tblGrid>
+        <w:gridCol w:w="4514"/>
+        <w:gridCol w:w="4514"/>
+      </w:tblGrid>
+      <w:tr>
+        <w:tc>
+          <w:tcPr>
+            <w:tcW w:type="dxa" w:w="4514"/>
+          </w:tcPr>
+          <w:p>
+            <w:r>
+              <w:rPr>
+                <w:b/>
+              </w:rPr>
+              <w:t>ID</w:t>
+            </w:r>
+          </w:p>
+        </w:tc>
+        <w:tc>
+          <w:tcPr>
+            <w:tcW w:type="dxa" w:w="4514"/>
+          </w:tcPr>
+          <w:p>
+            <w:r>
+              <w:t>CT-43</w:t>
+            </w:r>
+          </w:p>
+        </w:tc>
+      </w:tr>
+      <w:tr>
+        <w:tc>
+          <w:tcPr>
+            <w:tcW w:type="dxa" w:w="4514"/>
+          </w:tcPr>
+          <w:p>
+            <w:r>
+              <w:rPr>
+                <w:b/>
+              </w:rPr>
+              <w:t>Nome</w:t>
+            </w:r>
+          </w:p>
+        </w:tc>
+        <w:tc>
+          <w:tcPr>
+            <w:tcW w:type="dxa" w:w="4514"/>
+          </w:tcPr>
+          <w:p>
+            <w:r>
+              <w:t>converterPuzzleLichess — PGN do Lichess para FEN jogável</w:t>
+            </w:r>
+          </w:p>
+        </w:tc>
+      </w:tr>
+      <w:tr>
+        <w:tc>
+          <w:tcPr>
+            <w:tcW w:type="dxa" w:w="4514"/>
+          </w:tcPr>
+          <w:p>
+            <w:r>
+              <w:rPr>
+                <w:b/>
+              </w:rPr>
+              <w:t>Objetivo</w:t>
+            </w:r>
+          </w:p>
+        </w:tc>
+        <w:tc>
+          <w:tcPr>
+            <w:tcW w:type="dxa" w:w="4514"/>
+          </w:tcPr>
+          <w:p>
+            <w:r>
+              <w:t>Verificar que a resposta crua do Lichess é convertida num FEN em que a solução inteira é legal, e que entrada impossível lança erro.</w:t>
+            </w:r>
+          </w:p>
+        </w:tc>
+      </w:tr>
+      <w:tr>
+        <w:tc>
+          <w:tcPr>
+            <w:tcW w:type="dxa" w:w="4514"/>
+          </w:tcPr>
+          <w:p>
+            <w:r>
+              <w:rPr>
+                <w:b/>
+              </w:rPr>
+              <w:t>Pré-condições</w:t>
+            </w:r>
+          </w:p>
+        </w:tc>
+        <w:tc>
+          <w:tcPr>
+            <w:tcW w:type="dxa" w:w="4514"/>
+          </w:tcPr>
+          <w:p>
+            <w:r>
+              <w:t>Módulo src/lib/puzzleLichess e chess.js disponíveis.</w:t>
+            </w:r>
+          </w:p>
+        </w:tc>
+      </w:tr>
+      <w:tr>
+        <w:tc>
+          <w:tcPr>
+            <w:tcW w:type="dxa" w:w="4514"/>
+          </w:tcPr>
+          <w:p>
+            <w:r>
+              <w:rPr>
+                <w:b/>
+              </w:rPr>
+              <w:t>Fluxo / Passos</w:t>
+            </w:r>
+          </w:p>
+        </w:tc>
+        <w:tc>
+          <w:tcPr>
+            <w:tcW w:type="dxa" w:w="4514"/>
+          </w:tcPr>
+          <w:p>
+            <w:r>
+              <w:t>Entrada: pgn "e4 e5 Nf3 Nc6 Bc4 Bc5", solução ["e1g1","g8f6"].</w:t>
+            </w:r>
+            <w:r>
+              <w:br/>
+            </w:r>
+            <w:r>
+              <w:t>Caso de erro: solução ["h4h5"] impossível na posição.</w:t>
+            </w:r>
+          </w:p>
+        </w:tc>
+      </w:tr>
+      <w:tr>
+        <w:tc>
+          <w:tcPr>
+            <w:tcW w:type="dxa" w:w="4514"/>
+          </w:tcPr>
+          <w:p>
+            <w:r>
+              <w:rPr>
+                <w:b/>
+              </w:rPr>
+              <w:t>Resultado Esperado</w:t>
+            </w:r>
+          </w:p>
+        </w:tc>
+        <w:tc>
+          <w:tcPr>
+            <w:tcW w:type="dxa" w:w="4514"/>
+          </w:tcPr>
+          <w:p>
+            <w:r>
+              <w:t>Retorna {id, fen, solution, rating, themes} com a solução legal a partir do fen; no caso impossível, lança "não foi possível derivar um FEN".</w:t>
+            </w:r>
+          </w:p>
+        </w:tc>
+      </w:tr>
+      <w:tr>
+        <w:tc>
+          <w:tcPr>
+            <w:tcW w:type="dxa" w:w="4514"/>
+          </w:tcPr>
+          <w:p>
+            <w:r>
+              <w:rPr>
+                <w:b/>
+              </w:rPr>
+              <w:t>Status</w:t>
+            </w:r>
+          </w:p>
+        </w:tc>
+        <w:tc>
+          <w:tcPr>
+            <w:tcW w:type="dxa" w:w="4514"/>
+          </w:tcPr>
+          <w:p>
+            <w:r>
+              <w:t>🟢 Aprovado</w:t>
+            </w:r>
+          </w:p>
+        </w:tc>
+      </w:tr>
+    </w:tbl>
+    <w:p>
+      <w:r>
+        <w:rPr>
+          <w:b/>
+        </w:rPr>
+        <w:t xml:space="preserve">CT-44 — Catálogo de puzzles — nome persistido e listagem só de ativos</w:t>
+      </w:r>
+    </w:p>
+    <w:tbl>
+      <w:tblPr>
+        <w:tblStyle w:val="LightGrid-Accent1"/>
+        <w:tblW w:type="auto" w:w="0"/>
+        <w:tblLook w:firstColumn="1" w:firstRow="1" w:lastColumn="0" w:lastRow="0" w:noHBand="0" w:noVBand="1" w:val="04A0"/>
+      </w:tblPr>
+      <w:tblGrid>
+        <w:gridCol w:w="4514"/>
+        <w:gridCol w:w="4514"/>
+      </w:tblGrid>
+      <w:tr>
+        <w:tc>
+          <w:tcPr>
+            <w:tcW w:type="dxa" w:w="4514"/>
+          </w:tcPr>
+          <w:p>
+            <w:r>
+              <w:rPr>
+                <w:b/>
+              </w:rPr>
+              <w:t>ID</w:t>
+            </w:r>
+          </w:p>
+        </w:tc>
+        <w:tc>
+          <w:tcPr>
+            <w:tcW w:type="dxa" w:w="4514"/>
+          </w:tcPr>
+          <w:p>
+            <w:r>
+              <w:t>CT-44</w:t>
+            </w:r>
+          </w:p>
+        </w:tc>
+      </w:tr>
+      <w:tr>
+        <w:tc>
+          <w:tcPr>
+            <w:tcW w:type="dxa" w:w="4514"/>
+          </w:tcPr>
+          <w:p>
+            <w:r>
+              <w:rPr>
+                <w:b/>
+              </w:rPr>
+              <w:t>Nome</w:t>
+            </w:r>
+          </w:p>
+        </w:tc>
+        <w:tc>
+          <w:tcPr>
+            <w:tcW w:type="dxa" w:w="4514"/>
+          </w:tcPr>
+          <w:p>
+            <w:r>
+              <w:t>Catálogo de puzzles — nome persistido e listagem só de ativos</w:t>
+            </w:r>
+          </w:p>
+        </w:tc>
+      </w:tr>
+      <w:tr>
+        <w:tc>
+          <w:tcPr>
+            <w:tcW w:type="dxa" w:w="4514"/>
+          </w:tcPr>
+          <w:p>
+            <w:r>
+              <w:rPr>
+                <w:b/>
+              </w:rPr>
+              <w:t>Objetivo</w:t>
+            </w:r>
+          </w:p>
+        </w:tc>
+        <w:tc>
+          <w:tcPr>
+            <w:tcW w:type="dxa" w:w="4514"/>
+          </w:tcPr>
+          <w:p>
+            <w:r>
+              <w:t>Garantir que createPuzzle armazena o nome (com trim) e que listPuzzlesAtivos devolve apenas puzzles com ativo = true.</w:t>
+            </w:r>
+          </w:p>
+        </w:tc>
+      </w:tr>
+      <w:tr>
+        <w:tc>
+          <w:tcPr>
+            <w:tcW w:type="dxa" w:w="4514"/>
+          </w:tcPr>
+          <w:p>
+            <w:r>
+              <w:rPr>
+                <w:b/>
+              </w:rPr>
+              <w:t>Pré-condições</w:t>
+            </w:r>
+          </w:p>
+        </w:tc>
+        <w:tc>
+          <w:tcPr>
+            <w:tcW w:type="dxa" w:w="4514"/>
+          </w:tcPr>
+          <w:p>
+            <w:r>
+              <w:t>Banco de teste com schema (coluna nome aplicada); admin promovido.</w:t>
+            </w:r>
+          </w:p>
+        </w:tc>
+      </w:tr>
+      <w:tr>
+        <w:tc>
+          <w:tcPr>
+            <w:tcW w:type="dxa" w:w="4514"/>
+          </w:tcPr>
+          <w:p>
+            <w:r>
+              <w:rPr>
+                <w:b/>
+              </w:rPr>
+              <w:t>Fluxo / Passos</w:t>
+            </w:r>
+          </w:p>
+        </w:tc>
+        <w:tc>
+          <w:tcPr>
+            <w:tcW w:type="dxa" w:w="4514"/>
+          </w:tcPr>
+          <w:p>
+            <w:r>
+              <w:t>createPuzzle({nome:"  Garfo da vitória  ", ...}) → row.nome trimado;</w:t>
+            </w:r>
+            <w:r>
+              <w:br/>
+            </w:r>
+            <w:r>
+              <w:t>criar 2 puzzles, inativar 1 via updatePuzzle({ativo:false});</w:t>
+            </w:r>
+            <w:r>
+              <w:br/>
+            </w:r>
+            <w:r>
+              <w:t>chamar listPuzzlesAtivos().</w:t>
+            </w:r>
+          </w:p>
+        </w:tc>
+      </w:tr>
+      <w:tr>
+        <w:tc>
+          <w:tcPr>
+            <w:tcW w:type="dxa" w:w="4514"/>
+          </w:tcPr>
+          <w:p>
+            <w:r>
+              <w:rPr>
+                <w:b/>
+              </w:rPr>
+              <w:t>Resultado Esperado</w:t>
+            </w:r>
+          </w:p>
+        </w:tc>
+        <w:tc>
+          <w:tcPr>
+            <w:tcW w:type="dxa" w:w="4514"/>
+          </w:tcPr>
+          <w:p>
+            <w:r>
+              <w:t>row.nome == "Garfo da vitória"; a lista contém o ativo e NÃO contém o inativado.</w:t>
+            </w:r>
+          </w:p>
+        </w:tc>
+      </w:tr>
+      <w:tr>
+        <w:tc>
+          <w:tcPr>
+            <w:tcW w:type="dxa" w:w="4514"/>
+          </w:tcPr>
+          <w:p>
+            <w:r>
+              <w:rPr>
+                <w:b/>
+              </w:rPr>
+              <w:t>Status</w:t>
+            </w:r>
+          </w:p>
+        </w:tc>
+        <w:tc>
+          <w:tcPr>
+            <w:tcW w:type="dxa" w:w="4514"/>
+          </w:tcPr>
+          <w:p>
+            <w:r>
+              <w:t>🟢 Aprovado</w:t>
+            </w:r>
+          </w:p>
+        </w:tc>
+      </w:tr>
+    </w:tbl>
+    <w:p>
+      <w:r>
+        <w:rPr>
+          <w:b/>
+        </w:rPr>
+        <w:t xml:space="preserve">CT-45 — Cliente Lichess — montagem de URL e erro de status</w:t>
+      </w:r>
+    </w:p>
+    <w:tbl>
+      <w:tblPr>
+        <w:tblStyle w:val="LightGrid-Accent1"/>
+        <w:tblW w:type="auto" w:w="0"/>
+        <w:tblLook w:firstColumn="1" w:firstRow="1" w:lastColumn="0" w:lastRow="0" w:noHBand="0" w:noVBand="1" w:val="04A0"/>
+      </w:tblPr>
+      <w:tblGrid>
+        <w:gridCol w:w="4514"/>
+        <w:gridCol w:w="4514"/>
+      </w:tblGrid>
+      <w:tr>
+        <w:tc>
+          <w:tcPr>
+            <w:tcW w:type="dxa" w:w="4514"/>
+          </w:tcPr>
+          <w:p>
+            <w:r>
+              <w:rPr>
+                <w:b/>
+              </w:rPr>
+              <w:t>ID</w:t>
+            </w:r>
+          </w:p>
+        </w:tc>
+        <w:tc>
+          <w:tcPr>
+            <w:tcW w:type="dxa" w:w="4514"/>
+          </w:tcPr>
+          <w:p>
+            <w:r>
+              <w:t>CT-45</w:t>
+            </w:r>
+          </w:p>
+        </w:tc>
+      </w:tr>
+      <w:tr>
+        <w:tc>
+          <w:tcPr>
+            <w:tcW w:type="dxa" w:w="4514"/>
+          </w:tcPr>
+          <w:p>
+            <w:r>
+              <w:rPr>
+                <w:b/>
+              </w:rPr>
+              <w:t>Nome</w:t>
+            </w:r>
+          </w:p>
+        </w:tc>
+        <w:tc>
+          <w:tcPr>
+            <w:tcW w:type="dxa" w:w="4514"/>
+          </w:tcPr>
+          <w:p>
+            <w:r>
+              <w:t>Cliente Lichess — montagem de URL e erro de status</w:t>
+            </w:r>
+          </w:p>
+        </w:tc>
+      </w:tr>
+      <w:tr>
+        <w:tc>
+          <w:tcPr>
+            <w:tcW w:type="dxa" w:w="4514"/>
+          </w:tcPr>
+          <w:p>
+            <w:r>
+              <w:rPr>
+                <w:b/>
+              </w:rPr>
+              <w:t>Objetivo</w:t>
+            </w:r>
+          </w:p>
+        </w:tc>
+        <w:tc>
+          <w:tcPr>
+            <w:tcW w:type="dxa" w:w="4514"/>
+          </w:tcPr>
+          <w:p>
+            <w:r>
+              <w:t>Verificar que fetchNextPuzzle inclui angle/difficulty na query e que o guard de resposta não-ok propaga o status (origem do 502 no proxy).</w:t>
+            </w:r>
+          </w:p>
+        </w:tc>
+      </w:tr>
+      <w:tr>
+        <w:tc>
+          <w:tcPr>
+            <w:tcW w:type="dxa" w:w="4514"/>
+          </w:tcPr>
+          <w:p>
+            <w:r>
+              <w:rPr>
+                <w:b/>
+              </w:rPr>
+              <w:t>Pré-condições</w:t>
+            </w:r>
+          </w:p>
+        </w:tc>
+        <w:tc>
+          <w:tcPr>
+            <w:tcW w:type="dxa" w:w="4514"/>
+          </w:tcPr>
+          <w:p>
+            <w:r>
+              <w:t>src/services/lichess com fetch global mockado (vi.stubGlobal).</w:t>
+            </w:r>
+          </w:p>
+        </w:tc>
+      </w:tr>
+      <w:tr>
+        <w:tc>
+          <w:tcPr>
+            <w:tcW w:type="dxa" w:w="4514"/>
+          </w:tcPr>
+          <w:p>
+            <w:r>
+              <w:rPr>
+                <w:b/>
+              </w:rPr>
+              <w:t>Fluxo / Passos</w:t>
+            </w:r>
+          </w:p>
+        </w:tc>
+        <w:tc>
+          <w:tcPr>
+            <w:tcW w:type="dxa" w:w="4514"/>
+          </w:tcPr>
+          <w:p>
+            <w:r>
+              <w:t>mock ok → fetchNextPuzzle("fork","normal"): URL contém angle=fork e difficulty=normal;</w:t>
+            </w:r>
+            <w:r>
+              <w:br/>
+            </w:r>
+            <w:r>
+              <w:t>mock !ok (429) → fetchPuzzleById("00008") deve rejeitar.</w:t>
+            </w:r>
+          </w:p>
+        </w:tc>
+      </w:tr>
+      <w:tr>
+        <w:tc>
+          <w:tcPr>
+            <w:tcW w:type="dxa" w:w="4514"/>
+          </w:tcPr>
+          <w:p>
+            <w:r>
+              <w:rPr>
+                <w:b/>
+              </w:rPr>
+              <w:t>Resultado Esperado</w:t>
+            </w:r>
+          </w:p>
+        </w:tc>
+        <w:tc>
+          <w:tcPr>
+            <w:tcW w:type="dxa" w:w="4514"/>
+          </w:tcPr>
+          <w:p>
+            <w:r>
+              <w:t>URL correta para /puzzle/next; a Promise rejeita com erro contendo o status 429.</w:t>
+            </w:r>
+          </w:p>
+        </w:tc>
+      </w:tr>
+      <w:tr>
+        <w:tc>
+          <w:tcPr>
+            <w:tcW w:type="dxa" w:w="4514"/>
+          </w:tcPr>
+          <w:p>
+            <w:r>
+              <w:rPr>
+                <w:b/>
+              </w:rPr>
+              <w:t>Status</w:t>
+            </w:r>
+          </w:p>
+        </w:tc>
+        <w:tc>
+          <w:tcPr>
+            <w:tcW w:type="dxa" w:w="4514"/>
+          </w:tcPr>
+          <w:p>
+            <w:r>
+              <w:t>🟢 Aprovado</w:t>
+            </w:r>
+          </w:p>
+        </w:tc>
+      </w:tr>
+    </w:tbl>
+    <w:p>
       <w:pPr>
         <w:pStyle w:val="Heading2"/>
       </w:pPr>
@@ -11499,7 +12311,7 @@
     </w:p>
     <w:p>
       <w:r>
-        <w:t>A suíte completa contempla 41 casos de teste distribuídos em três níveis:</w:t>
+        <w:t>A suíte completa contempla 45 casos de teste distribuídos em três níveis:</w:t>
       </w:r>
     </w:p>
     <w:tbl>
@@ -11682,11 +12494,43 @@
           </w:p>
         </w:tc>
       </w:tr>
+      <w:tr>
+        <w:tc>
+          <w:tcPr>
+            <w:tcW w:type="dxa" w:w="3010"/>
+          </w:tcPr>
+          <w:p>
+            <w:r>
+              <w:t>Unit/Integração — Puzzles dos Mestres</w:t>
+            </w:r>
+          </w:p>
+        </w:tc>
+        <w:tc>
+          <w:tcPr>
+            <w:tcW w:type="dxa" w:w="3010"/>
+          </w:tcPr>
+          <w:p>
+            <w:r>
+              <w:t>CT-42 a CT-45</w:t>
+            </w:r>
+          </w:p>
+        </w:tc>
+        <w:tc>
+          <w:tcPr>
+            <w:tcW w:type="dxa" w:w="3010"/>
+          </w:tcPr>
+          <w:p>
+            <w:r>
+              <w:t>4</w:t>
+            </w:r>
+          </w:p>
+        </w:tc>
+      </w:tr>
     </w:tbl>
     <w:p/>
     <w:p>
       <w:r>
-        <w:t>Total: 41 casos. Ferramentas usadas: Vitest 4 (unitários + integração), Playwright 1.49 (E2E), @vitest/coverage-v8 (cobertura ≥70% em src/lib).</w:t>
+        <w:t>Total: 45 casos. Ferramentas usadas: Vitest 4 (unitários + integração), Playwright 1.49 (E2E), @vitest/coverage-v8 (cobertura ≥70% em src/lib e src/services).</w:t>
       </w:r>
     </w:p>
     <w:sectPr>

</xml_diff>